<commit_message>
Guia para seguir trabajando desde otra computadora
Que viaja por GitHub y que no (el .env, la base y media/ van a mano),
como dejar el segundo equipo andando, y la regla que evita la mayoria
de los lios: no dejar cambios sin subir en una maquina y editar en la
otra.

El paso de restaurar quedo probado: creando el rol y la base antes, el
pg_restore conserva el dueno de las tablas y entran los 402 estudiantes.

Co-Authored-By: Claude Opus 5 <noreply@anthropic.com>
</commit_message>
<xml_diff>
--- a/documentacion/Capitulo_II_Marco_Teorico_revisado.docx
+++ b/documentacion/Capitulo_II_Marco_Teorico_revisado.docx
@@ -171,7 +171,7 @@
         <w:jc w:val="both"/>
       </w:pPr>
       <w:r>
-        <w:t xml:space="preserve">Conviene distinguir el seguimiento de la evaluación. La evaluación emite un juicio sobre un resultado en un momento determinado; el seguimiento observa la trayectoria completa e identifica desviaciones. Una calificación trimestral es un acto de evaluación; advertir que un estudiante acumuló seis faltas en el primer mes y que su promedio descendió respecto del trimestre anterior es un acto de seguimiento. De ello se desprende una consecuencia de diseño: no basta con almacenar la nota final; es necesario conservar la granularidad de los eventos que la componen.</w:t>
+        <w:t xml:space="preserve">Conviene distinguir el seguimiento de la evaluación. La evaluación emite un juicio sobre un resultado en un momento determinado; el seguimiento observa la trayectoria completa e identifica desviaciones. Una calificación trimestral es un acto de evaluación; advertir que un estudiante acumuló seis faltas en el primer mes y que su promedio descendió respecto del trimestre anterior es un acto de seguimiento. De ello se desprende una consecuencia de diseño: no basta con almacenar la nota final; es necesario conservar la granularidad de los eventos que la componen —cada día de asistencia, cada actividad evaluada con su dimensión y su puntaje, cada entrega de tarea—, porque solo esa granularidad permite reconstruir la trayectoria y detectar la desviación.</w:t>
       </w:r>
     </w:p>
     <w:p>
@@ -229,7 +229,27 @@
         <w:jc w:val="both"/>
       </w:pPr>
       <w:r>
-        <w:t xml:space="preserve">El sistema desarrollado implementa este concepto a partir del indicador de asistencia. El umbral de faltas acumuladas está parametrizado como variable de configuración, de modo que la Dirección puede ajustarlo sin modificar el software. La Figura 1 resume el mecanismo: cada registro de asistencia desencadena el recuento de faltas de la gestión y, si se alcanza el umbral y no existe una citación automática pendiente, se genera una citación al tutor y se notifica al estudiante y al tutor por la aplicación y por correo electrónico.</w:t>
+        <w:t xml:space="preserve">El sistema desarrollado vigila tres de estos indicadores: la asistencia, el cumplimiento de tareas y las calificaciones por debajo de la nota de aprobación. Los umbrales —faltas acumuladas y tareas sin entregar— son parámetros de configuración externos al código, de modo que la Dirección puede ajustarlos sin intervención del desarrollador.</w:t>
+      </w:r>
+    </w:p>
+    <w:p>
+      <w:pPr>
+        <w:spacing w:after="160" w:line="360"/>
+        <w:ind w:firstLine="709"/>
+        <w:jc w:val="both"/>
+      </w:pPr>
+      <w:r>
+        <w:t xml:space="preserve">Un segundo principio gobierna el diseño de estos mecanismos: la </w:t>
+      </w:r>
+      <w:r>
+        <w:rPr>
+          <w:b/>
+          <w:bCs/>
+        </w:rPr>
+        <w:t xml:space="preserve">fatiga de alertas</w:t>
+      </w:r>
+      <w:r>
+        <w:t xml:space="preserve">. Ancker et al. (2017) demostraron, en sistemas de apoyo a la decisión clínica, que la probabilidad de que un aviso sea atendido disminuye a medida que aumenta el número de avisos recibidos, y que los avisos repetidos sobre un hecho ya conocido son los que más contribuyen a esa pérdida de atención. Trasladado a este dominio: un tutor que recibe quince notificaciones sueltas en un día termina por no leer ninguna, incluida la que importaba. De ahí se derivan dos reglas de diseño que el sistema aplica: cada hecho se avisa una sola vez, aunque la revisión vuelva a detectarlo los días siguientes, y los avisos se clasifican por nivel de urgencia, de modo que los urgentes se emiten de inmediato y los de atención se agrupan en un resumen diario. La Figura 1 representa este mecanismo.</w:t>
       </w:r>
     </w:p>
     <w:p>
@@ -245,7 +265,7 @@
           <w:sz w:val="22"/>
           <w:szCs w:val="22"/>
         </w:rPr>
-        <w:t xml:space="preserve">Figura 1: Mecanismo de alerta temprana por inasistencias</w:t>
+        <w:t xml:space="preserve">Figura 1: Mecanismo de alerta temprana multiindicador</w:t>
       </w:r>
     </w:p>
     <w:p>
@@ -256,7 +276,7 @@
       <w:r>
         <w:drawing>
           <wp:inline distT="0" distB="0" distL="0" distR="0">
-            <wp:extent cx="5715000" cy="2790480"/>
+            <wp:extent cx="5715000" cy="2719031"/>
             <wp:effectExtent t="0" r="0" b="0" l="0"/>
             <wp:docPr id="1" name="" descr="" title=""/>
             <wp:cNvGraphicFramePr>
@@ -281,7 +301,7 @@
                   <pic:spPr bwMode="auto">
                     <a:xfrm>
                       <a:off x="0" y="0"/>
-                      <a:ext cx="5715000" cy="2790480"/>
+                      <a:ext cx="5715000" cy="2719031"/>
                     </a:xfrm>
                     <a:prstGeom prst="rect">
                       <a:avLst/>
@@ -306,7 +326,7 @@
           <w:sz w:val="20"/>
           <w:szCs w:val="20"/>
         </w:rPr>
-        <w:t xml:space="preserve">Fuente: Elaboración propia con base en Balfanz et al. (2007).</w:t>
+        <w:t xml:space="preserve">Fuente: Elaboración propia con base en Balfanz et al. (2007) y Ancker et al. (2017).</w:t>
       </w:r>
     </w:p>
     <w:p>
@@ -314,7 +334,45 @@
         <w:pStyle w:val="Heading2"/>
       </w:pPr>
       <w:r>
-        <w:t xml:space="preserve">2.1.4. Marco normativo de la evaluación en el Estado Plurinacional de Bolivia</w:t>
+        <w:t xml:space="preserve">2.1.4. Comunicación entre la escuela y la familia</w:t>
+      </w:r>
+    </w:p>
+    <w:p>
+      <w:pPr>
+        <w:spacing w:after="160" w:line="360"/>
+        <w:ind w:firstLine="709"/>
+        <w:jc w:val="both"/>
+      </w:pPr>
+      <w:r>
+        <w:t xml:space="preserve">La alerta temprana solo produce efecto si la información llega a quien puede intervenir. Epstein (2011) sistematiza la relación entre escuela y familia en seis tipos de participación, entre los cuales la </w:t>
+      </w:r>
+      <w:r>
+        <w:rPr>
+          <w:b/>
+          <w:bCs/>
+        </w:rPr>
+        <w:t xml:space="preserve">comunicación</w:t>
+      </w:r>
+      <w:r>
+        <w:t xml:space="preserve"> —el flujo regular y bidireccional de información sobre el progreso del estudiante— es la condición que habilita a las demás. Jeynes (2007), en un metaanálisis de 52 estudios sobre estudiantes de secundaria, encontró una asociación consistente entre la participación de los padres y el rendimiento académico, con un efecto apreciable incluso en las formas menos estructuradas de participación.</w:t>
+      </w:r>
+    </w:p>
+    <w:p>
+      <w:pPr>
+        <w:spacing w:after="160" w:line="360"/>
+        <w:ind w:firstLine="709"/>
+        <w:jc w:val="both"/>
+      </w:pPr>
+      <w:r>
+        <w:t xml:space="preserve">La consecuencia para el diseño del sistema es directa: el portal del tutor, la mensajería con el docente y las notificaciones no son funcionalidades accesorias, sino el canal por el cual el dato capturado en el aula se convierte en intervención familiar. El diseño asume además una restricción del contexto: el tutor no acude al sistema a buscar la información, de modo que es el sistema el que debe llegar a él, por la aplicación, por correo electrónico y por notificación en el teléfono.</w:t>
+      </w:r>
+    </w:p>
+    <w:p>
+      <w:pPr>
+        <w:pStyle w:val="Heading2"/>
+      </w:pPr>
+      <w:r>
+        <w:t xml:space="preserve">2.1.5. Marco normativo de la evaluación en el Estado Plurinacional de Bolivia</w:t>
       </w:r>
     </w:p>
     <w:p>
@@ -322,7 +380,7 @@
         <w:pStyle w:val="Heading3"/>
       </w:pPr>
       <w:r>
-        <w:t xml:space="preserve">2.1.4.1. Ley N.º 070 y las dimensiones de la evaluación</w:t>
+        <w:t xml:space="preserve">2.1.5.1. Ley N.º 070 y las dimensiones de la evaluación</w:t>
       </w:r>
     </w:p>
     <w:p>
@@ -426,15 +484,7 @@
         <w:jc w:val="both"/>
       </w:pPr>
       <w:r>
-        <w:t xml:space="preserve">El docente valora estas cuatro dimensiones a lo largo del trimestre y las consolida en una calificación única por área de saberes y conocimientos, en la escala de 1 a 100. Esta calificación consolidada es la unidad de información que el sistema almacena y que se transcribe al registro oficial.</w:t>
-      </w:r>
-    </w:p>
-    <w:p>
-      <w:pPr>
-        <w:pStyle w:val="Heading3"/>
-      </w:pPr>
-      <w:r>
-        <w:t xml:space="preserve">2.1.4.2. Instrumentos de registro: cuaderno pedagógico, centralizador y libreta</w:t>
+        <w:t xml:space="preserve">El docente valora estas cuatro dimensiones a lo largo del trimestre y las consolida en una calificación única por área de saberes y conocimientos, en la escala de 1 a 100. La normativa fija las dimensiones y la escala, pero no una única forma de repartir los puntos entre ellas; cada unidad educativa adopta una ponderación en su planilla institucional.</w:t>
       </w:r>
     </w:p>
     <w:p>
@@ -444,7 +494,7 @@
         <w:jc w:val="both"/>
       </w:pPr>
       <w:r>
-        <w:t xml:space="preserve">El cuaderno pedagógico es el instrumento técnico-administrativo de uso obligatorio para el docente. Funciona como registro primario del proceso de aprendizaje: en él se asientan la asistencia, las valoraciones cualitativas y cuantitativas y las observaciones del docente antes de su centralización (Ministerio de Educación, 2023). El centralizador es la planilla que reúne, para un curso completo, las calificaciones de todos los estudiantes en todas las áreas de un período; la libreta escolar es el documento individual que comunica esas calificaciones al estudiante y a su familia.</w:t>
+        <w:t xml:space="preserve">El sistema desarrollado modela explícitamente esta estructura, reproduciendo la ponderación que la Unidad Educativa Eduardo Avaroa emplea en su planilla: Ser vale 10 puntos, Saber 45, Hacer 40 y la autoevaluación del estudiante —que operativiza la dimensión Decidir— 5 puntos, hasta sumar 100. Dentro de Ser, Saber y Hacer el docente registra las actividades evaluativas que considere —una prueba, un práctico, una exposición—, cada una calificada sobre el máximo de su dimensión, y la nota de la dimensión es el promedio de sus actividades. A ello se añaden hasta 5 puntos por actividades extracurriculares, sin que el trimestre supere los 100 puntos.</w:t>
       </w:r>
     </w:p>
     <w:p>
@@ -454,6 +504,64 @@
         <w:jc w:val="both"/>
       </w:pPr>
       <w:r>
+        <w:t xml:space="preserve">Este diseño produce tres consecuencias relevantes. Primero, la </w:t>
+      </w:r>
+      <w:r>
+        <w:rPr>
+          <w:b/>
+          <w:bCs/>
+        </w:rPr>
+        <w:t xml:space="preserve">trazabilidad</w:t>
+      </w:r>
+      <w:r>
+        <w:t xml:space="preserve">: la nota trimestral no se digita, sino que se calcula a partir de los puntajes registrados, de modo que siempre puede explicarse de dónde proviene. Segundo, la </w:t>
+      </w:r>
+      <w:r>
+        <w:rPr>
+          <w:b/>
+          <w:bCs/>
+        </w:rPr>
+        <w:t xml:space="preserve">correspondencia con el registro oficial</w:t>
+      </w:r>
+      <w:r>
+        <w:t xml:space="preserve">: el total consolidado sobre 100 sigue siendo la unidad que se transcribe al Módulo Académico del SIE, por lo que el desglose enriquece el registro interno sin apartarse de lo que el Estado exige. Tercero, la </w:t>
+      </w:r>
+      <w:r>
+        <w:rPr>
+          <w:b/>
+          <w:bCs/>
+        </w:rPr>
+        <w:t xml:space="preserve">parametrización</w:t>
+      </w:r>
+      <w:r>
+        <w:t xml:space="preserve">: la ponderación está declarada en un único lugar del sistema, de manera que un cambio en la planilla institucional no obliga a modificar las pantallas ni los reportes.</w:t>
+      </w:r>
+    </w:p>
+    <w:p>
+      <w:pPr>
+        <w:pStyle w:val="Heading3"/>
+      </w:pPr>
+      <w:r>
+        <w:t xml:space="preserve">2.1.5.2. Instrumentos de registro: cuaderno pedagógico, centralizador y libreta</w:t>
+      </w:r>
+    </w:p>
+    <w:p>
+      <w:pPr>
+        <w:spacing w:after="160" w:line="360"/>
+        <w:ind w:firstLine="709"/>
+        <w:jc w:val="both"/>
+      </w:pPr>
+      <w:r>
+        <w:t xml:space="preserve">El cuaderno pedagógico es el instrumento técnico-administrativo de uso obligatorio para el docente. Funciona como registro primario del proceso de aprendizaje: en él se asientan la asistencia, las valoraciones cualitativas y cuantitativas y las observaciones del docente antes de su centralización (Ministerio de Educación, 2023). El centralizador es la planilla que reúne, para un curso completo, las calificaciones de todos los estudiantes en todas las áreas de un período; la libreta escolar es el documento individual que comunica esas calificaciones al estudiante y a su familia.</w:t>
+      </w:r>
+    </w:p>
+    <w:p>
+      <w:pPr>
+        <w:spacing w:after="160" w:line="360"/>
+        <w:ind w:firstLine="709"/>
+        <w:jc w:val="both"/>
+      </w:pPr>
+      <w:r>
         <w:t xml:space="preserve">En términos funcionales, el sistema desarrollado constituye la digitalización del cuaderno pedagógico: las entidades que modela —asistencia, nota, tarea, entrega— se corresponden con las secciones que el docente completa a mano, y el centralizador y el boletín se generan como resultados derivados de los datos ya capturados, en lugar de elaborarse mediante transcripción manual.</w:t>
       </w:r>
     </w:p>
@@ -462,7 +570,7 @@
         <w:pStyle w:val="Heading2"/>
       </w:pPr>
       <w:r>
-        <w:t xml:space="preserve">2.1.5. El Sistema de Información Educativa (SIE) y la delimitación del proyecto</w:t>
+        <w:t xml:space="preserve">2.1.6. El Sistema de Información Educativa (SIE) y la delimitación del proyecto</w:t>
       </w:r>
     </w:p>
     <w:p>
@@ -2177,7 +2285,7 @@
         <w:jc w:val="both"/>
       </w:pPr>
       <w:r>
-        <w:t xml:space="preserve">La elección de Scrum responde a cuatro razones: (1) los requerimientos eran parcialmente conocidos al inicio y solo pudieron precisarse mediante entrevistas sucesivas con la Dirección y la Secretaría; (2) los docentes y tutores no pueden validar un documento de especificación, pero sí una pantalla funcionando, lo que exige validación temprana con incrementos; (3) el dominio se descompone naturalmente en módulos independientes —gestión académica, calificaciones, asistencia, tareas, comunicaciones, noticias, notificaciones y portal de padres— que admiten desarrollo incremental; y (4) la entrega frecuente de código verificado reduce el riesgo de descubrir errores arquitectónicos en fases avanzadas, cuando su corrección es más costosa.</w:t>
+        <w:t xml:space="preserve">La elección de Scrum responde a cuatro razones: (1) los requerimientos eran parcialmente conocidos al inicio y solo pudieron precisarse mediante entrevistas sucesivas con la Dirección y la Secretaría; (2) los docentes y tutores no pueden validar un documento de especificación, pero sí una pantalla funcionando, lo que exige validación temprana con incrementos; (3) el dominio se descompone naturalmente en módulos independientes —cuentas y acceso, gestión académica, calificaciones, asistencia, tareas, comunicaciones, noticias, notificaciones, mensajería, portal de padres y mantenimiento— que admiten desarrollo incremental; y (4) la entrega frecuente de código verificado reduce el riesgo de descubrir errores arquitectónicos en fases avanzadas, cuando su corrección es más costosa.</w:t>
       </w:r>
     </w:p>
     <w:p>
@@ -2787,7 +2895,7 @@
     </w:p>
     <w:tbl>
       <w:tblPr>
-        <w:tblW w:type="dxa" w:w="9118"/>
+        <w:tblW w:type="dxa" w:w="9119"/>
         <w:tblBorders>
           <w:top w:val="single" w:color="auto" w:sz="4"/>
           <w:left w:val="single" w:color="auto" w:sz="4"/>
@@ -2798,10 +2906,10 @@
         </w:tblBorders>
       </w:tblPr>
       <w:tblGrid>
-        <w:gridCol w:w="2026"/>
+        <w:gridCol w:w="1925"/>
         <w:gridCol w:w="2938"/>
-        <w:gridCol w:w="1317"/>
-        <w:gridCol w:w="2837"/>
+        <w:gridCol w:w="1520"/>
+        <w:gridCol w:w="2736"/>
       </w:tblGrid>
       <w:tr>
         <w:trPr>
@@ -2809,7 +2917,7 @@
         </w:trPr>
         <w:tc>
           <w:tcPr>
-            <w:tcW w:type="dxa" w:w="2026"/>
+            <w:tcW w:type="dxa" w:w="1925"/>
             <w:tcBorders>
               <w:top w:val="single" w:color="808080" w:sz="4"/>
               <w:left w:val="single" w:color="808080" w:sz="4"/>
@@ -2867,7 +2975,7 @@
         </w:tc>
         <w:tc>
           <w:tcPr>
-            <w:tcW w:type="dxa" w:w="1317"/>
+            <w:tcW w:type="dxa" w:w="1520"/>
             <w:tcBorders>
               <w:top w:val="single" w:color="808080" w:sz="4"/>
               <w:left w:val="single" w:color="808080" w:sz="4"/>
@@ -2896,7 +3004,7 @@
         </w:tc>
         <w:tc>
           <w:tcPr>
-            <w:tcW w:type="dxa" w:w="2837"/>
+            <w:tcW w:type="dxa" w:w="2736"/>
             <w:tcBorders>
               <w:top w:val="single" w:color="808080" w:sz="4"/>
               <w:left w:val="single" w:color="808080" w:sz="4"/>
@@ -2930,7 +3038,7 @@
         </w:trPr>
         <w:tc>
           <w:tcPr>
-            <w:tcW w:type="dxa" w:w="2026"/>
+            <w:tcW w:type="dxa" w:w="1925"/>
             <w:tcBorders>
               <w:top w:val="single" w:color="808080" w:sz="4"/>
               <w:left w:val="single" w:color="808080" w:sz="4"/>
@@ -2986,35 +3094,35 @@
         </w:tc>
         <w:tc>
           <w:tcPr>
-            <w:tcW w:type="dxa" w:w="1317"/>
-            <w:tcBorders>
-              <w:top w:val="single" w:color="808080" w:sz="4"/>
-              <w:left w:val="single" w:color="808080" w:sz="4"/>
-              <w:bottom w:val="single" w:color="808080" w:sz="4"/>
-              <w:right w:val="single" w:color="808080" w:sz="4"/>
-            </w:tcBorders>
-            <w:tcMar>
-              <w:top w:type="dxa" w:w="60"/>
-              <w:left w:type="dxa" w:w="100"/>
-              <w:bottom w:type="dxa" w:w="60"/>
-              <w:right w:type="dxa" w:w="100"/>
-            </w:tcMar>
-          </w:tcPr>
-          <w:p>
-            <w:r>
-              <w:rPr>
-                <w:b w:val="false"/>
-                <w:bCs w:val="false"/>
-                <w:sz w:val="20"/>
-                <w:szCs w:val="20"/>
-              </w:rPr>
-              <w:t xml:space="preserve">3.x</w:t>
-            </w:r>
-          </w:p>
-        </w:tc>
-        <w:tc>
-          <w:tcPr>
-            <w:tcW w:type="dxa" w:w="2837"/>
+            <w:tcW w:type="dxa" w:w="1520"/>
+            <w:tcBorders>
+              <w:top w:val="single" w:color="808080" w:sz="4"/>
+              <w:left w:val="single" w:color="808080" w:sz="4"/>
+              <w:bottom w:val="single" w:color="808080" w:sz="4"/>
+              <w:right w:val="single" w:color="808080" w:sz="4"/>
+            </w:tcBorders>
+            <w:tcMar>
+              <w:top w:type="dxa" w:w="60"/>
+              <w:left w:type="dxa" w:w="100"/>
+              <w:bottom w:type="dxa" w:w="60"/>
+              <w:right w:type="dxa" w:w="100"/>
+            </w:tcMar>
+          </w:tcPr>
+          <w:p>
+            <w:r>
+              <w:rPr>
+                <w:b w:val="false"/>
+                <w:bCs w:val="false"/>
+                <w:sz w:val="20"/>
+                <w:szCs w:val="20"/>
+              </w:rPr>
+              <w:t xml:space="preserve">3.12</w:t>
+            </w:r>
+          </w:p>
+        </w:tc>
+        <w:tc>
+          <w:tcPr>
+            <w:tcW w:type="dxa" w:w="2736"/>
             <w:tcBorders>
               <w:top w:val="single" w:color="808080" w:sz="4"/>
               <w:left w:val="single" w:color="808080" w:sz="4"/>
@@ -3047,7 +3155,7 @@
         </w:trPr>
         <w:tc>
           <w:tcPr>
-            <w:tcW w:type="dxa" w:w="2026"/>
+            <w:tcW w:type="dxa" w:w="1925"/>
             <w:tcBorders>
               <w:top w:val="single" w:color="808080" w:sz="4"/>
               <w:left w:val="single" w:color="808080" w:sz="4"/>
@@ -3103,7 +3211,7 @@
         </w:tc>
         <w:tc>
           <w:tcPr>
-            <w:tcW w:type="dxa" w:w="1317"/>
+            <w:tcW w:type="dxa" w:w="1520"/>
             <w:tcBorders>
               <w:top w:val="single" w:color="808080" w:sz="4"/>
               <w:left w:val="single" w:color="808080" w:sz="4"/>
@@ -3131,7 +3239,7 @@
         </w:tc>
         <w:tc>
           <w:tcPr>
-            <w:tcW w:type="dxa" w:w="2837"/>
+            <w:tcW w:type="dxa" w:w="2736"/>
             <w:tcBorders>
               <w:top w:val="single" w:color="808080" w:sz="4"/>
               <w:left w:val="single" w:color="808080" w:sz="4"/>
@@ -3164,7 +3272,7 @@
         </w:trPr>
         <w:tc>
           <w:tcPr>
-            <w:tcW w:type="dxa" w:w="2026"/>
+            <w:tcW w:type="dxa" w:w="1925"/>
             <w:tcBorders>
               <w:top w:val="single" w:color="808080" w:sz="4"/>
               <w:left w:val="single" w:color="808080" w:sz="4"/>
@@ -3220,7 +3328,7 @@
         </w:tc>
         <w:tc>
           <w:tcPr>
-            <w:tcW w:type="dxa" w:w="1317"/>
+            <w:tcW w:type="dxa" w:w="1520"/>
             <w:tcBorders>
               <w:top w:val="single" w:color="808080" w:sz="4"/>
               <w:left w:val="single" w:color="808080" w:sz="4"/>
@@ -3248,7 +3356,7 @@
         </w:tc>
         <w:tc>
           <w:tcPr>
-            <w:tcW w:type="dxa" w:w="2837"/>
+            <w:tcW w:type="dxa" w:w="2736"/>
             <w:tcBorders>
               <w:top w:val="single" w:color="808080" w:sz="4"/>
               <w:left w:val="single" w:color="808080" w:sz="4"/>
@@ -3281,7 +3389,7 @@
         </w:trPr>
         <w:tc>
           <w:tcPr>
-            <w:tcW w:type="dxa" w:w="2026"/>
+            <w:tcW w:type="dxa" w:w="1925"/>
             <w:tcBorders>
               <w:top w:val="single" w:color="808080" w:sz="4"/>
               <w:left w:val="single" w:color="808080" w:sz="4"/>
@@ -3331,63 +3439,63 @@
                 <w:sz w:val="20"/>
                 <w:szCs w:val="20"/>
               </w:rPr>
-              <w:t xml:space="preserve">psycopg2-binary</w:t>
-            </w:r>
-          </w:p>
-        </w:tc>
-        <w:tc>
-          <w:tcPr>
-            <w:tcW w:type="dxa" w:w="1317"/>
-            <w:tcBorders>
-              <w:top w:val="single" w:color="808080" w:sz="4"/>
-              <w:left w:val="single" w:color="808080" w:sz="4"/>
-              <w:bottom w:val="single" w:color="808080" w:sz="4"/>
-              <w:right w:val="single" w:color="808080" w:sz="4"/>
-            </w:tcBorders>
-            <w:tcMar>
-              <w:top w:type="dxa" w:w="60"/>
-              <w:left w:type="dxa" w:w="100"/>
-              <w:bottom w:type="dxa" w:w="60"/>
-              <w:right w:type="dxa" w:w="100"/>
-            </w:tcMar>
-          </w:tcPr>
-          <w:p>
-            <w:r>
-              <w:rPr>
-                <w:b w:val="false"/>
-                <w:bCs w:val="false"/>
-                <w:sz w:val="20"/>
-                <w:szCs w:val="20"/>
-              </w:rPr>
-              <w:t xml:space="preserve">2.9.12</w:t>
-            </w:r>
-          </w:p>
-        </w:tc>
-        <w:tc>
-          <w:tcPr>
-            <w:tcW w:type="dxa" w:w="2837"/>
-            <w:tcBorders>
-              <w:top w:val="single" w:color="808080" w:sz="4"/>
-              <w:left w:val="single" w:color="808080" w:sz="4"/>
-              <w:bottom w:val="single" w:color="808080" w:sz="4"/>
-              <w:right w:val="single" w:color="808080" w:sz="4"/>
-            </w:tcBorders>
-            <w:tcMar>
-              <w:top w:type="dxa" w:w="60"/>
-              <w:left w:type="dxa" w:w="100"/>
-              <w:bottom w:type="dxa" w:w="60"/>
-              <w:right w:type="dxa" w:w="100"/>
-            </w:tcMar>
-          </w:tcPr>
-          <w:p>
-            <w:r>
-              <w:rPr>
-                <w:b w:val="false"/>
-                <w:bCs w:val="false"/>
-                <w:sz w:val="20"/>
-                <w:szCs w:val="20"/>
-              </w:rPr>
-              <w:t xml:space="preserve">Conector entre Django y PostgreSQL</w:t>
+              <w:t xml:space="preserve">psycopg2-binary / dj-database-url</w:t>
+            </w:r>
+          </w:p>
+        </w:tc>
+        <w:tc>
+          <w:tcPr>
+            <w:tcW w:type="dxa" w:w="1520"/>
+            <w:tcBorders>
+              <w:top w:val="single" w:color="808080" w:sz="4"/>
+              <w:left w:val="single" w:color="808080" w:sz="4"/>
+              <w:bottom w:val="single" w:color="808080" w:sz="4"/>
+              <w:right w:val="single" w:color="808080" w:sz="4"/>
+            </w:tcBorders>
+            <w:tcMar>
+              <w:top w:type="dxa" w:w="60"/>
+              <w:left w:type="dxa" w:w="100"/>
+              <w:bottom w:type="dxa" w:w="60"/>
+              <w:right w:type="dxa" w:w="100"/>
+            </w:tcMar>
+          </w:tcPr>
+          <w:p>
+            <w:r>
+              <w:rPr>
+                <w:b w:val="false"/>
+                <w:bCs w:val="false"/>
+                <w:sz w:val="20"/>
+                <w:szCs w:val="20"/>
+              </w:rPr>
+              <w:t xml:space="preserve">2.9.12 / 3.1.2</w:t>
+            </w:r>
+          </w:p>
+        </w:tc>
+        <w:tc>
+          <w:tcPr>
+            <w:tcW w:type="dxa" w:w="2736"/>
+            <w:tcBorders>
+              <w:top w:val="single" w:color="808080" w:sz="4"/>
+              <w:left w:val="single" w:color="808080" w:sz="4"/>
+              <w:bottom w:val="single" w:color="808080" w:sz="4"/>
+              <w:right w:val="single" w:color="808080" w:sz="4"/>
+            </w:tcBorders>
+            <w:tcMar>
+              <w:top w:type="dxa" w:w="60"/>
+              <w:left w:type="dxa" w:w="100"/>
+              <w:bottom w:type="dxa" w:w="60"/>
+              <w:right w:type="dxa" w:w="100"/>
+            </w:tcMar>
+          </w:tcPr>
+          <w:p>
+            <w:r>
+              <w:rPr>
+                <w:b w:val="false"/>
+                <w:bCs w:val="false"/>
+                <w:sz w:val="20"/>
+                <w:szCs w:val="20"/>
+              </w:rPr>
+              <w:t xml:space="preserve">Conexión con PostgreSQL y lectura de la cadena de conexión del entorno</w:t>
             </w:r>
           </w:p>
         </w:tc>
@@ -3398,7 +3506,7 @@
         </w:trPr>
         <w:tc>
           <w:tcPr>
-            <w:tcW w:type="dxa" w:w="2026"/>
+            <w:tcW w:type="dxa" w:w="1925"/>
             <w:tcBorders>
               <w:top w:val="single" w:color="808080" w:sz="4"/>
               <w:left w:val="single" w:color="808080" w:sz="4"/>
@@ -3454,7 +3562,7 @@
         </w:tc>
         <w:tc>
           <w:tcPr>
-            <w:tcW w:type="dxa" w:w="1317"/>
+            <w:tcW w:type="dxa" w:w="1520"/>
             <w:tcBorders>
               <w:top w:val="single" w:color="808080" w:sz="4"/>
               <w:left w:val="single" w:color="808080" w:sz="4"/>
@@ -3482,7 +3590,7 @@
         </w:tc>
         <w:tc>
           <w:tcPr>
-            <w:tcW w:type="dxa" w:w="2837"/>
+            <w:tcW w:type="dxa" w:w="2736"/>
             <w:tcBorders>
               <w:top w:val="single" w:color="808080" w:sz="4"/>
               <w:left w:val="single" w:color="808080" w:sz="4"/>
@@ -3515,7 +3623,7 @@
         </w:trPr>
         <w:tc>
           <w:tcPr>
-            <w:tcW w:type="dxa" w:w="2026"/>
+            <w:tcW w:type="dxa" w:w="1925"/>
             <w:tcBorders>
               <w:top w:val="single" w:color="808080" w:sz="4"/>
               <w:left w:val="single" w:color="808080" w:sz="4"/>
@@ -3571,7 +3679,7 @@
         </w:tc>
         <w:tc>
           <w:tcPr>
-            <w:tcW w:type="dxa" w:w="1317"/>
+            <w:tcW w:type="dxa" w:w="1520"/>
             <w:tcBorders>
               <w:top w:val="single" w:color="808080" w:sz="4"/>
               <w:left w:val="single" w:color="808080" w:sz="4"/>
@@ -3599,7 +3707,7 @@
         </w:tc>
         <w:tc>
           <w:tcPr>
-            <w:tcW w:type="dxa" w:w="2837"/>
+            <w:tcW w:type="dxa" w:w="2736"/>
             <w:tcBorders>
               <w:top w:val="single" w:color="808080" w:sz="4"/>
               <w:left w:val="single" w:color="808080" w:sz="4"/>
@@ -3632,7 +3740,7 @@
         </w:trPr>
         <w:tc>
           <w:tcPr>
-            <w:tcW w:type="dxa" w:w="2026"/>
+            <w:tcW w:type="dxa" w:w="1925"/>
             <w:tcBorders>
               <w:top w:val="single" w:color="808080" w:sz="4"/>
               <w:left w:val="single" w:color="808080" w:sz="4"/>
@@ -3688,7 +3796,7 @@
         </w:tc>
         <w:tc>
           <w:tcPr>
-            <w:tcW w:type="dxa" w:w="1317"/>
+            <w:tcW w:type="dxa" w:w="1520"/>
             <w:tcBorders>
               <w:top w:val="single" w:color="808080" w:sz="4"/>
               <w:left w:val="single" w:color="808080" w:sz="4"/>
@@ -3716,7 +3824,7 @@
         </w:tc>
         <w:tc>
           <w:tcPr>
-            <w:tcW w:type="dxa" w:w="2837"/>
+            <w:tcW w:type="dxa" w:w="2736"/>
             <w:tcBorders>
               <w:top w:val="single" w:color="808080" w:sz="4"/>
               <w:left w:val="single" w:color="808080" w:sz="4"/>
@@ -3749,29 +3857,29 @@
         </w:trPr>
         <w:tc>
           <w:tcPr>
-            <w:tcW w:type="dxa" w:w="2026"/>
-            <w:tcBorders>
-              <w:top w:val="single" w:color="808080" w:sz="4"/>
-              <w:left w:val="single" w:color="808080" w:sz="4"/>
-              <w:bottom w:val="single" w:color="808080" w:sz="4"/>
-              <w:right w:val="single" w:color="808080" w:sz="4"/>
-            </w:tcBorders>
-            <w:tcMar>
-              <w:top w:type="dxa" w:w="60"/>
-              <w:left w:type="dxa" w:w="100"/>
-              <w:bottom w:type="dxa" w:w="60"/>
-              <w:right w:type="dxa" w:w="100"/>
-            </w:tcMar>
-          </w:tcPr>
-          <w:p>
-            <w:r>
-              <w:rPr>
-                <w:b w:val="false"/>
-                <w:bCs w:val="false"/>
-                <w:sz w:val="20"/>
-                <w:szCs w:val="20"/>
-              </w:rPr>
-              <w:t xml:space="preserve">Generación de PDF</w:t>
+            <w:tcW w:type="dxa" w:w="1925"/>
+            <w:tcBorders>
+              <w:top w:val="single" w:color="808080" w:sz="4"/>
+              <w:left w:val="single" w:color="808080" w:sz="4"/>
+              <w:bottom w:val="single" w:color="808080" w:sz="4"/>
+              <w:right w:val="single" w:color="808080" w:sz="4"/>
+            </w:tcBorders>
+            <w:tcMar>
+              <w:top w:type="dxa" w:w="60"/>
+              <w:left w:type="dxa" w:w="100"/>
+              <w:bottom w:type="dxa" w:w="60"/>
+              <w:right w:type="dxa" w:w="100"/>
+            </w:tcMar>
+          </w:tcPr>
+          <w:p>
+            <w:r>
+              <w:rPr>
+                <w:b w:val="false"/>
+                <w:bCs w:val="false"/>
+                <w:sz w:val="20"/>
+                <w:szCs w:val="20"/>
+              </w:rPr>
+              <w:t xml:space="preserve">Reportes</w:t>
             </w:r>
           </w:p>
         </w:tc>
@@ -3799,63 +3907,63 @@
                 <w:sz w:val="20"/>
                 <w:szCs w:val="20"/>
               </w:rPr>
-              <w:t xml:space="preserve">ReportLab</w:t>
-            </w:r>
-          </w:p>
-        </w:tc>
-        <w:tc>
-          <w:tcPr>
-            <w:tcW w:type="dxa" w:w="1317"/>
-            <w:tcBorders>
-              <w:top w:val="single" w:color="808080" w:sz="4"/>
-              <w:left w:val="single" w:color="808080" w:sz="4"/>
-              <w:bottom w:val="single" w:color="808080" w:sz="4"/>
-              <w:right w:val="single" w:color="808080" w:sz="4"/>
-            </w:tcBorders>
-            <w:tcMar>
-              <w:top w:type="dxa" w:w="60"/>
-              <w:left w:type="dxa" w:w="100"/>
-              <w:bottom w:type="dxa" w:w="60"/>
-              <w:right w:type="dxa" w:w="100"/>
-            </w:tcMar>
-          </w:tcPr>
-          <w:p>
-            <w:r>
-              <w:rPr>
-                <w:b w:val="false"/>
-                <w:bCs w:val="false"/>
-                <w:sz w:val="20"/>
-                <w:szCs w:val="20"/>
-              </w:rPr>
-              <w:t xml:space="preserve">5.0.0</w:t>
-            </w:r>
-          </w:p>
-        </w:tc>
-        <w:tc>
-          <w:tcPr>
-            <w:tcW w:type="dxa" w:w="2837"/>
-            <w:tcBorders>
-              <w:top w:val="single" w:color="808080" w:sz="4"/>
-              <w:left w:val="single" w:color="808080" w:sz="4"/>
-              <w:bottom w:val="single" w:color="808080" w:sz="4"/>
-              <w:right w:val="single" w:color="808080" w:sz="4"/>
-            </w:tcBorders>
-            <w:tcMar>
-              <w:top w:type="dxa" w:w="60"/>
-              <w:left w:type="dxa" w:w="100"/>
-              <w:bottom w:type="dxa" w:w="60"/>
-              <w:right w:type="dxa" w:w="100"/>
-            </w:tcMar>
-          </w:tcPr>
-          <w:p>
-            <w:r>
-              <w:rPr>
-                <w:b w:val="false"/>
-                <w:bCs w:val="false"/>
-                <w:sz w:val="20"/>
-                <w:szCs w:val="20"/>
-              </w:rPr>
-              <w:t xml:space="preserve">Emisión de boletines de calificaciones</w:t>
+              <w:t xml:space="preserve">ReportLab / openpyxl</w:t>
+            </w:r>
+          </w:p>
+        </w:tc>
+        <w:tc>
+          <w:tcPr>
+            <w:tcW w:type="dxa" w:w="1520"/>
+            <w:tcBorders>
+              <w:top w:val="single" w:color="808080" w:sz="4"/>
+              <w:left w:val="single" w:color="808080" w:sz="4"/>
+              <w:bottom w:val="single" w:color="808080" w:sz="4"/>
+              <w:right w:val="single" w:color="808080" w:sz="4"/>
+            </w:tcBorders>
+            <w:tcMar>
+              <w:top w:type="dxa" w:w="60"/>
+              <w:left w:type="dxa" w:w="100"/>
+              <w:bottom w:type="dxa" w:w="60"/>
+              <w:right w:type="dxa" w:w="100"/>
+            </w:tcMar>
+          </w:tcPr>
+          <w:p>
+            <w:r>
+              <w:rPr>
+                <w:b w:val="false"/>
+                <w:bCs w:val="false"/>
+                <w:sz w:val="20"/>
+                <w:szCs w:val="20"/>
+              </w:rPr>
+              <w:t xml:space="preserve">5.0.0 / 3.1.5</w:t>
+            </w:r>
+          </w:p>
+        </w:tc>
+        <w:tc>
+          <w:tcPr>
+            <w:tcW w:type="dxa" w:w="2736"/>
+            <w:tcBorders>
+              <w:top w:val="single" w:color="808080" w:sz="4"/>
+              <w:left w:val="single" w:color="808080" w:sz="4"/>
+              <w:bottom w:val="single" w:color="808080" w:sz="4"/>
+              <w:right w:val="single" w:color="808080" w:sz="4"/>
+            </w:tcBorders>
+            <w:tcMar>
+              <w:top w:type="dxa" w:w="60"/>
+              <w:left w:type="dxa" w:w="100"/>
+              <w:bottom w:type="dxa" w:w="60"/>
+              <w:right w:type="dxa" w:w="100"/>
+            </w:tcMar>
+          </w:tcPr>
+          <w:p>
+            <w:r>
+              <w:rPr>
+                <w:b w:val="false"/>
+                <w:bCs w:val="false"/>
+                <w:sz w:val="20"/>
+                <w:szCs w:val="20"/>
+              </w:rPr>
+              <w:t xml:space="preserve">Boletines en PDF y planillas en Excel</w:t>
             </w:r>
           </w:p>
         </w:tc>
@@ -3866,7 +3974,7 @@
         </w:trPr>
         <w:tc>
           <w:tcPr>
-            <w:tcW w:type="dxa" w:w="2026"/>
+            <w:tcW w:type="dxa" w:w="1925"/>
             <w:tcBorders>
               <w:top w:val="single" w:color="808080" w:sz="4"/>
               <w:left w:val="single" w:color="808080" w:sz="4"/>
@@ -3922,7 +4030,7 @@
         </w:tc>
         <w:tc>
           <w:tcPr>
-            <w:tcW w:type="dxa" w:w="1317"/>
+            <w:tcW w:type="dxa" w:w="1520"/>
             <w:tcBorders>
               <w:top w:val="single" w:color="808080" w:sz="4"/>
               <w:left w:val="single" w:color="808080" w:sz="4"/>
@@ -3950,7 +4058,7 @@
         </w:tc>
         <w:tc>
           <w:tcPr>
-            <w:tcW w:type="dxa" w:w="2837"/>
+            <w:tcW w:type="dxa" w:w="2736"/>
             <w:tcBorders>
               <w:top w:val="single" w:color="808080" w:sz="4"/>
               <w:left w:val="single" w:color="808080" w:sz="4"/>
@@ -3983,29 +4091,29 @@
         </w:trPr>
         <w:tc>
           <w:tcPr>
-            <w:tcW w:type="dxa" w:w="2026"/>
-            <w:tcBorders>
-              <w:top w:val="single" w:color="808080" w:sz="4"/>
-              <w:left w:val="single" w:color="808080" w:sz="4"/>
-              <w:bottom w:val="single" w:color="808080" w:sz="4"/>
-              <w:right w:val="single" w:color="808080" w:sz="4"/>
-            </w:tcBorders>
-            <w:tcMar>
-              <w:top w:type="dxa" w:w="60"/>
-              <w:left w:type="dxa" w:w="100"/>
-              <w:bottom w:type="dxa" w:w="60"/>
-              <w:right w:type="dxa" w:w="100"/>
-            </w:tcMar>
-          </w:tcPr>
-          <w:p>
-            <w:r>
-              <w:rPr>
-                <w:b w:val="false"/>
-                <w:bCs w:val="false"/>
-                <w:sz w:val="20"/>
-                <w:szCs w:val="20"/>
-              </w:rPr>
-              <w:t xml:space="preserve">Control de versiones</w:t>
+            <w:tcW w:type="dxa" w:w="1925"/>
+            <w:tcBorders>
+              <w:top w:val="single" w:color="808080" w:sz="4"/>
+              <w:left w:val="single" w:color="808080" w:sz="4"/>
+              <w:bottom w:val="single" w:color="808080" w:sz="4"/>
+              <w:right w:val="single" w:color="808080" w:sz="4"/>
+            </w:tcBorders>
+            <w:tcMar>
+              <w:top w:type="dxa" w:w="60"/>
+              <w:left w:type="dxa" w:w="100"/>
+              <w:bottom w:type="dxa" w:w="60"/>
+              <w:right w:type="dxa" w:w="100"/>
+            </w:tcMar>
+          </w:tcPr>
+          <w:p>
+            <w:r>
+              <w:rPr>
+                <w:b w:val="false"/>
+                <w:bCs w:val="false"/>
+                <w:sz w:val="20"/>
+                <w:szCs w:val="20"/>
+              </w:rPr>
+              <w:t xml:space="preserve">Notificaciones push</w:t>
             </w:r>
           </w:p>
         </w:tc>
@@ -4033,13 +4141,13 @@
                 <w:sz w:val="20"/>
                 <w:szCs w:val="20"/>
               </w:rPr>
-              <w:t xml:space="preserve">Git / GitHub</w:t>
-            </w:r>
-          </w:p>
-        </w:tc>
-        <w:tc>
-          <w:tcPr>
-            <w:tcW w:type="dxa" w:w="1317"/>
+              <w:t xml:space="preserve">pywebpush (VAPID)</w:t>
+            </w:r>
+          </w:p>
+        </w:tc>
+        <w:tc>
+          <w:tcPr>
+            <w:tcW w:type="dxa" w:w="1520"/>
             <w:tcBorders>
               <w:top w:val="single" w:color="808080" w:sz="4"/>
               <w:left w:val="single" w:color="808080" w:sz="4"/>
@@ -4067,29 +4175,29 @@
         </w:tc>
         <w:tc>
           <w:tcPr>
-            <w:tcW w:type="dxa" w:w="2837"/>
-            <w:tcBorders>
-              <w:top w:val="single" w:color="808080" w:sz="4"/>
-              <w:left w:val="single" w:color="808080" w:sz="4"/>
-              <w:bottom w:val="single" w:color="808080" w:sz="4"/>
-              <w:right w:val="single" w:color="808080" w:sz="4"/>
-            </w:tcBorders>
-            <w:tcMar>
-              <w:top w:type="dxa" w:w="60"/>
-              <w:left w:type="dxa" w:w="100"/>
-              <w:bottom w:type="dxa" w:w="60"/>
-              <w:right w:type="dxa" w:w="100"/>
-            </w:tcMar>
-          </w:tcPr>
-          <w:p>
-            <w:r>
-              <w:rPr>
-                <w:b w:val="false"/>
-                <w:bCs w:val="false"/>
-                <w:sz w:val="20"/>
-                <w:szCs w:val="20"/>
-              </w:rPr>
-              <w:t xml:space="preserve">Gestión del código fuente</w:t>
+            <w:tcW w:type="dxa" w:w="2736"/>
+            <w:tcBorders>
+              <w:top w:val="single" w:color="808080" w:sz="4"/>
+              <w:left w:val="single" w:color="808080" w:sz="4"/>
+              <w:bottom w:val="single" w:color="808080" w:sz="4"/>
+              <w:right w:val="single" w:color="808080" w:sz="4"/>
+            </w:tcBorders>
+            <w:tcMar>
+              <w:top w:type="dxa" w:w="60"/>
+              <w:left w:type="dxa" w:w="100"/>
+              <w:bottom w:type="dxa" w:w="60"/>
+              <w:right w:type="dxa" w:w="100"/>
+            </w:tcMar>
+          </w:tcPr>
+          <w:p>
+            <w:r>
+              <w:rPr>
+                <w:b w:val="false"/>
+                <w:bCs w:val="false"/>
+                <w:sz w:val="20"/>
+                <w:szCs w:val="20"/>
+              </w:rPr>
+              <w:t xml:space="preserve">Envío de avisos al navegador y al teléfono</w:t>
             </w:r>
           </w:p>
         </w:tc>
@@ -4100,7 +4208,358 @@
         </w:trPr>
         <w:tc>
           <w:tcPr>
-            <w:tcW w:type="dxa" w:w="2026"/>
+            <w:tcW w:type="dxa" w:w="1925"/>
+            <w:tcBorders>
+              <w:top w:val="single" w:color="808080" w:sz="4"/>
+              <w:left w:val="single" w:color="808080" w:sz="4"/>
+              <w:bottom w:val="single" w:color="808080" w:sz="4"/>
+              <w:right w:val="single" w:color="808080" w:sz="4"/>
+            </w:tcBorders>
+            <w:tcMar>
+              <w:top w:type="dxa" w:w="60"/>
+              <w:left w:type="dxa" w:w="100"/>
+              <w:bottom w:type="dxa" w:w="60"/>
+              <w:right w:type="dxa" w:w="100"/>
+            </w:tcMar>
+          </w:tcPr>
+          <w:p>
+            <w:r>
+              <w:rPr>
+                <w:b w:val="false"/>
+                <w:bCs w:val="false"/>
+                <w:sz w:val="20"/>
+                <w:szCs w:val="20"/>
+              </w:rPr>
+              <w:t xml:space="preserve">Servidor de aplicación</w:t>
+            </w:r>
+          </w:p>
+        </w:tc>
+        <w:tc>
+          <w:tcPr>
+            <w:tcW w:type="dxa" w:w="2938"/>
+            <w:tcBorders>
+              <w:top w:val="single" w:color="808080" w:sz="4"/>
+              <w:left w:val="single" w:color="808080" w:sz="4"/>
+              <w:bottom w:val="single" w:color="808080" w:sz="4"/>
+              <w:right w:val="single" w:color="808080" w:sz="4"/>
+            </w:tcBorders>
+            <w:tcMar>
+              <w:top w:type="dxa" w:w="60"/>
+              <w:left w:type="dxa" w:w="100"/>
+              <w:bottom w:type="dxa" w:w="60"/>
+              <w:right w:type="dxa" w:w="100"/>
+            </w:tcMar>
+          </w:tcPr>
+          <w:p>
+            <w:r>
+              <w:rPr>
+                <w:b w:val="false"/>
+                <w:bCs w:val="false"/>
+                <w:sz w:val="20"/>
+                <w:szCs w:val="20"/>
+              </w:rPr>
+              <w:t xml:space="preserve">Gunicorn</w:t>
+            </w:r>
+          </w:p>
+        </w:tc>
+        <w:tc>
+          <w:tcPr>
+            <w:tcW w:type="dxa" w:w="1520"/>
+            <w:tcBorders>
+              <w:top w:val="single" w:color="808080" w:sz="4"/>
+              <w:left w:val="single" w:color="808080" w:sz="4"/>
+              <w:bottom w:val="single" w:color="808080" w:sz="4"/>
+              <w:right w:val="single" w:color="808080" w:sz="4"/>
+            </w:tcBorders>
+            <w:tcMar>
+              <w:top w:type="dxa" w:w="60"/>
+              <w:left w:type="dxa" w:w="100"/>
+              <w:bottom w:type="dxa" w:w="60"/>
+              <w:right w:type="dxa" w:w="100"/>
+            </w:tcMar>
+          </w:tcPr>
+          <w:p>
+            <w:r>
+              <w:rPr>
+                <w:b w:val="false"/>
+                <w:bCs w:val="false"/>
+                <w:sz w:val="20"/>
+                <w:szCs w:val="20"/>
+              </w:rPr>
+              <w:t xml:space="preserve">26.2.0</w:t>
+            </w:r>
+          </w:p>
+        </w:tc>
+        <w:tc>
+          <w:tcPr>
+            <w:tcW w:type="dxa" w:w="2736"/>
+            <w:tcBorders>
+              <w:top w:val="single" w:color="808080" w:sz="4"/>
+              <w:left w:val="single" w:color="808080" w:sz="4"/>
+              <w:bottom w:val="single" w:color="808080" w:sz="4"/>
+              <w:right w:val="single" w:color="808080" w:sz="4"/>
+            </w:tcBorders>
+            <w:tcMar>
+              <w:top w:type="dxa" w:w="60"/>
+              <w:left w:type="dxa" w:w="100"/>
+              <w:bottom w:type="dxa" w:w="60"/>
+              <w:right w:type="dxa" w:w="100"/>
+            </w:tcMar>
+          </w:tcPr>
+          <w:p>
+            <w:r>
+              <w:rPr>
+                <w:b w:val="false"/>
+                <w:bCs w:val="false"/>
+                <w:sz w:val="20"/>
+                <w:szCs w:val="20"/>
+              </w:rPr>
+              <w:t xml:space="preserve">Servidor WSGI en producción</w:t>
+            </w:r>
+          </w:p>
+        </w:tc>
+      </w:tr>
+      <w:tr>
+        <w:trPr>
+          <w:cantSplit/>
+        </w:trPr>
+        <w:tc>
+          <w:tcPr>
+            <w:tcW w:type="dxa" w:w="1925"/>
+            <w:tcBorders>
+              <w:top w:val="single" w:color="808080" w:sz="4"/>
+              <w:left w:val="single" w:color="808080" w:sz="4"/>
+              <w:bottom w:val="single" w:color="808080" w:sz="4"/>
+              <w:right w:val="single" w:color="808080" w:sz="4"/>
+            </w:tcBorders>
+            <w:tcMar>
+              <w:top w:type="dxa" w:w="60"/>
+              <w:left w:type="dxa" w:w="100"/>
+              <w:bottom w:type="dxa" w:w="60"/>
+              <w:right w:type="dxa" w:w="100"/>
+            </w:tcMar>
+          </w:tcPr>
+          <w:p>
+            <w:r>
+              <w:rPr>
+                <w:b w:val="false"/>
+                <w:bCs w:val="false"/>
+                <w:sz w:val="20"/>
+                <w:szCs w:val="20"/>
+              </w:rPr>
+              <w:t xml:space="preserve">Archivos estáticos</w:t>
+            </w:r>
+          </w:p>
+        </w:tc>
+        <w:tc>
+          <w:tcPr>
+            <w:tcW w:type="dxa" w:w="2938"/>
+            <w:tcBorders>
+              <w:top w:val="single" w:color="808080" w:sz="4"/>
+              <w:left w:val="single" w:color="808080" w:sz="4"/>
+              <w:bottom w:val="single" w:color="808080" w:sz="4"/>
+              <w:right w:val="single" w:color="808080" w:sz="4"/>
+            </w:tcBorders>
+            <w:tcMar>
+              <w:top w:type="dxa" w:w="60"/>
+              <w:left w:type="dxa" w:w="100"/>
+              <w:bottom w:type="dxa" w:w="60"/>
+              <w:right w:type="dxa" w:w="100"/>
+            </w:tcMar>
+          </w:tcPr>
+          <w:p>
+            <w:r>
+              <w:rPr>
+                <w:b w:val="false"/>
+                <w:bCs w:val="false"/>
+                <w:sz w:val="20"/>
+                <w:szCs w:val="20"/>
+              </w:rPr>
+              <w:t xml:space="preserve">WhiteNoise</w:t>
+            </w:r>
+          </w:p>
+        </w:tc>
+        <w:tc>
+          <w:tcPr>
+            <w:tcW w:type="dxa" w:w="1520"/>
+            <w:tcBorders>
+              <w:top w:val="single" w:color="808080" w:sz="4"/>
+              <w:left w:val="single" w:color="808080" w:sz="4"/>
+              <w:bottom w:val="single" w:color="808080" w:sz="4"/>
+              <w:right w:val="single" w:color="808080" w:sz="4"/>
+            </w:tcBorders>
+            <w:tcMar>
+              <w:top w:type="dxa" w:w="60"/>
+              <w:left w:type="dxa" w:w="100"/>
+              <w:bottom w:type="dxa" w:w="60"/>
+              <w:right w:type="dxa" w:w="100"/>
+            </w:tcMar>
+          </w:tcPr>
+          <w:p>
+            <w:r>
+              <w:rPr>
+                <w:b w:val="false"/>
+                <w:bCs w:val="false"/>
+                <w:sz w:val="20"/>
+                <w:szCs w:val="20"/>
+              </w:rPr>
+              <w:t xml:space="preserve">6.12.0</w:t>
+            </w:r>
+          </w:p>
+        </w:tc>
+        <w:tc>
+          <w:tcPr>
+            <w:tcW w:type="dxa" w:w="2736"/>
+            <w:tcBorders>
+              <w:top w:val="single" w:color="808080" w:sz="4"/>
+              <w:left w:val="single" w:color="808080" w:sz="4"/>
+              <w:bottom w:val="single" w:color="808080" w:sz="4"/>
+              <w:right w:val="single" w:color="808080" w:sz="4"/>
+            </w:tcBorders>
+            <w:tcMar>
+              <w:top w:type="dxa" w:w="60"/>
+              <w:left w:type="dxa" w:w="100"/>
+              <w:bottom w:type="dxa" w:w="60"/>
+              <w:right w:type="dxa" w:w="100"/>
+            </w:tcMar>
+          </w:tcPr>
+          <w:p>
+            <w:r>
+              <w:rPr>
+                <w:b w:val="false"/>
+                <w:bCs w:val="false"/>
+                <w:sz w:val="20"/>
+                <w:szCs w:val="20"/>
+              </w:rPr>
+              <w:t xml:space="preserve">Entrega de archivos estáticos comprimidos y versionados</w:t>
+            </w:r>
+          </w:p>
+        </w:tc>
+      </w:tr>
+      <w:tr>
+        <w:trPr>
+          <w:cantSplit/>
+        </w:trPr>
+        <w:tc>
+          <w:tcPr>
+            <w:tcW w:type="dxa" w:w="1925"/>
+            <w:tcBorders>
+              <w:top w:val="single" w:color="808080" w:sz="4"/>
+              <w:left w:val="single" w:color="808080" w:sz="4"/>
+              <w:bottom w:val="single" w:color="808080" w:sz="4"/>
+              <w:right w:val="single" w:color="808080" w:sz="4"/>
+            </w:tcBorders>
+            <w:tcMar>
+              <w:top w:type="dxa" w:w="60"/>
+              <w:left w:type="dxa" w:w="100"/>
+              <w:bottom w:type="dxa" w:w="60"/>
+              <w:right w:type="dxa" w:w="100"/>
+            </w:tcMar>
+          </w:tcPr>
+          <w:p>
+            <w:r>
+              <w:rPr>
+                <w:b w:val="false"/>
+                <w:bCs w:val="false"/>
+                <w:sz w:val="20"/>
+                <w:szCs w:val="20"/>
+              </w:rPr>
+              <w:t xml:space="preserve">Control de versiones</w:t>
+            </w:r>
+          </w:p>
+        </w:tc>
+        <w:tc>
+          <w:tcPr>
+            <w:tcW w:type="dxa" w:w="2938"/>
+            <w:tcBorders>
+              <w:top w:val="single" w:color="808080" w:sz="4"/>
+              <w:left w:val="single" w:color="808080" w:sz="4"/>
+              <w:bottom w:val="single" w:color="808080" w:sz="4"/>
+              <w:right w:val="single" w:color="808080" w:sz="4"/>
+            </w:tcBorders>
+            <w:tcMar>
+              <w:top w:type="dxa" w:w="60"/>
+              <w:left w:type="dxa" w:w="100"/>
+              <w:bottom w:type="dxa" w:w="60"/>
+              <w:right w:type="dxa" w:w="100"/>
+            </w:tcMar>
+          </w:tcPr>
+          <w:p>
+            <w:r>
+              <w:rPr>
+                <w:b w:val="false"/>
+                <w:bCs w:val="false"/>
+                <w:sz w:val="20"/>
+                <w:szCs w:val="20"/>
+              </w:rPr>
+              <w:t xml:space="preserve">Git / GitHub</w:t>
+            </w:r>
+          </w:p>
+        </w:tc>
+        <w:tc>
+          <w:tcPr>
+            <w:tcW w:type="dxa" w:w="1520"/>
+            <w:tcBorders>
+              <w:top w:val="single" w:color="808080" w:sz="4"/>
+              <w:left w:val="single" w:color="808080" w:sz="4"/>
+              <w:bottom w:val="single" w:color="808080" w:sz="4"/>
+              <w:right w:val="single" w:color="808080" w:sz="4"/>
+            </w:tcBorders>
+            <w:tcMar>
+              <w:top w:type="dxa" w:w="60"/>
+              <w:left w:type="dxa" w:w="100"/>
+              <w:bottom w:type="dxa" w:w="60"/>
+              <w:right w:type="dxa" w:w="100"/>
+            </w:tcMar>
+          </w:tcPr>
+          <w:p>
+            <w:r>
+              <w:rPr>
+                <w:b w:val="false"/>
+                <w:bCs w:val="false"/>
+                <w:sz w:val="20"/>
+                <w:szCs w:val="20"/>
+              </w:rPr>
+              <w:t xml:space="preserve">—</w:t>
+            </w:r>
+          </w:p>
+        </w:tc>
+        <w:tc>
+          <w:tcPr>
+            <w:tcW w:type="dxa" w:w="2736"/>
+            <w:tcBorders>
+              <w:top w:val="single" w:color="808080" w:sz="4"/>
+              <w:left w:val="single" w:color="808080" w:sz="4"/>
+              <w:bottom w:val="single" w:color="808080" w:sz="4"/>
+              <w:right w:val="single" w:color="808080" w:sz="4"/>
+            </w:tcBorders>
+            <w:tcMar>
+              <w:top w:type="dxa" w:w="60"/>
+              <w:left w:type="dxa" w:w="100"/>
+              <w:bottom w:type="dxa" w:w="60"/>
+              <w:right w:type="dxa" w:w="100"/>
+            </w:tcMar>
+          </w:tcPr>
+          <w:p>
+            <w:r>
+              <w:rPr>
+                <w:b w:val="false"/>
+                <w:bCs w:val="false"/>
+                <w:sz w:val="20"/>
+                <w:szCs w:val="20"/>
+              </w:rPr>
+              <w:t xml:space="preserve">Gestión del código fuente</w:t>
+            </w:r>
+          </w:p>
+        </w:tc>
+      </w:tr>
+      <w:tr>
+        <w:trPr>
+          <w:cantSplit/>
+        </w:trPr>
+        <w:tc>
+          <w:tcPr>
+            <w:tcW w:type="dxa" w:w="1925"/>
             <w:tcBorders>
               <w:top w:val="single" w:color="808080" w:sz="4"/>
               <w:left w:val="single" w:color="808080" w:sz="4"/>
@@ -4156,7 +4615,7 @@
         </w:tc>
         <w:tc>
           <w:tcPr>
-            <w:tcW w:type="dxa" w:w="1317"/>
+            <w:tcW w:type="dxa" w:w="1520"/>
             <w:tcBorders>
               <w:top w:val="single" w:color="808080" w:sz="4"/>
               <w:left w:val="single" w:color="808080" w:sz="4"/>
@@ -4184,7 +4643,7 @@
         </w:tc>
         <w:tc>
           <w:tcPr>
-            <w:tcW w:type="dxa" w:w="2837"/>
+            <w:tcW w:type="dxa" w:w="2736"/>
             <w:tcBorders>
               <w:top w:val="single" w:color="808080" w:sz="4"/>
               <w:left w:val="single" w:color="808080" w:sz="4"/>
@@ -4364,6 +4823,34 @@
       </w:pPr>
       <w:r>
         <w:t xml:space="preserve">El Django Template Language (DTL) separa la presentación de la lógica mediante una sintaxis restringida que permite mostrar variables, iterar colecciones y evaluar condiciones, pero impide ejecutar lógica de negocio arbitraria. Su característica más relevante para la mantenibilidad es la herencia de plantillas: una plantilla base define la estructura común y declara bloques que las plantillas hijas sobrescriben. Complementariamente, Django genera un panel de administración a partir de los modelos, con operaciones de creación, consulta, actualización y eliminación y control de permisos incorporado, lo que cubre sin desarrollo adicional las tareas de configuración institucional de baja frecuencia.</w:t>
+      </w:r>
+    </w:p>
+    <w:p>
+      <w:pPr>
+        <w:pStyle w:val="Heading3"/>
+      </w:pPr>
+      <w:r>
+        <w:t xml:space="preserve">2.5.2.5. Comandos de gestión y procesos programados</w:t>
+      </w:r>
+    </w:p>
+    <w:p>
+      <w:pPr>
+        <w:spacing w:after="160" w:line="360"/>
+        <w:ind w:firstLine="709"/>
+        <w:jc w:val="both"/>
+      </w:pPr>
+      <w:r>
+        <w:t xml:space="preserve">Además de atender peticiones HTTP, Django permite definir </w:t>
+      </w:r>
+      <w:r>
+        <w:rPr>
+          <w:b/>
+          <w:bCs/>
+        </w:rPr>
+        <w:t xml:space="preserve">comandos de gestión</w:t>
+      </w:r>
+      <w:r>
+        <w:t xml:space="preserve">: rutinas invocables desde la línea de órdenes que acceden al mismo modelo de datos y a la misma lógica de negocio que las vistas (Django Software Foundation, 2026). Su utilidad aquí es conceptual antes que técnica: no todo el trabajo de un sistema de seguimiento ocurre cuando un usuario pulsa un botón. La revisión de indicadores de riesgo descrita en la sección 2.1.3 es un proceso periódico que debe ejecutarse aunque nadie esté conectado, y el respaldo de la base de datos otro. Estos comandos, agendados por el planificador del sistema operativo o del proveedor de alojamiento, constituyen la contraparte no interactiva de la aplicación.</w:t>
       </w:r>
     </w:p>
     <w:p>
@@ -4631,7 +5118,7 @@
         <w:pStyle w:val="Heading2"/>
       </w:pPr>
       <w:r>
-        <w:t xml:space="preserve">2.5.5. Bibliotecas complementarias, despliegue y herramientas</w:t>
+        <w:t xml:space="preserve">2.5.5. Aplicación web progresiva y notificaciones push</w:t>
       </w:r>
     </w:p>
     <w:p>
@@ -4641,34 +5128,37 @@
         <w:jc w:val="both"/>
       </w:pPr>
       <w:r>
+        <w:t xml:space="preserve">Una </w:t>
+      </w:r>
+      <w:r>
         <w:rPr>
           <w:b/>
           <w:bCs/>
         </w:rPr>
-        <w:t xml:space="preserve">ReportLab</w:t>
-      </w:r>
-      <w:r>
-        <w:t xml:space="preserve"> es la biblioteca de generación de documentos PDF empleada para emitir el boletín de calificaciones; </w:t>
+        <w:t xml:space="preserve">aplicación web progresiva</w:t>
+      </w:r>
+      <w:r>
+        <w:t xml:space="preserve"> (PWA) es una aplicación web que, mediante un conjunto de tecnologías estándar del navegador, adquiere características tradicionalmente reservadas a las aplicaciones nativas: puede instalarse en la pantalla de inicio, funcionar con conectividad intermitente y recibir avisos aunque no esté abierta (Ater, 2017). Descansa sobre dos piezas: el </w:t>
       </w:r>
       <w:r>
         <w:rPr>
           <w:b/>
           <w:bCs/>
         </w:rPr>
-        <w:t xml:space="preserve">Pillow</w:t>
-      </w:r>
-      <w:r>
-        <w:t xml:space="preserve"> es la biblioteca de procesamiento de imágenes requerida por Django para los campos de imagen; y </w:t>
+        <w:t xml:space="preserve">manifiesto de aplicación web</w:t>
+      </w:r>
+      <w:r>
+        <w:t xml:space="preserve">, archivo declarativo que indica al navegador el nombre, los iconos y la forma de presentación (World Wide Web Consortium, 2025a), y el *</w:t>
       </w:r>
       <w:r>
         <w:rPr>
           <w:b/>
           <w:bCs/>
         </w:rPr>
-        <w:t xml:space="preserve">python-decouple</w:t>
-      </w:r>
-      <w:r>
-        <w:t xml:space="preserve"> externaliza la configuración y las credenciales en un archivo de entorno excluido del control de versiones.</w:t>
+        <w:t xml:space="preserve">service worker</w:t>
+      </w:r>
+      <w:r>
+        <w:t xml:space="preserve">*, un script que el navegador ejecuta en segundo plano, independiente de cualquier pestaña, y que actúa como intermediario de las peticiones de red y receptor de los mensajes push (World Wide Web Consortium, 2025b).</w:t>
       </w:r>
     </w:p>
     <w:p>
@@ -4678,93 +5168,27 @@
         <w:jc w:val="both"/>
       </w:pPr>
       <w:r>
-        <w:t xml:space="preserve">Para el despliegue, WSGI (</w:t>
-      </w:r>
-      <w:r>
-        <w:rPr>
-          <w:i/>
-          <w:iCs/>
-        </w:rPr>
-        <w:t xml:space="preserve">Web Server Gateway Interface</w:t>
-      </w:r>
-      <w:r>
-        <w:t xml:space="preserve">) es la especificación estándar de la interfaz entre un servidor web y una aplicación Python (Eby, 2010); permite desplegar el sistema tras un servidor de aplicación compatible, como Gunicorn, detrás de un servidor web como Nginx. Finalmente, </w:t>
+        <w:t xml:space="preserve">Sobre esa base opera el </w:t>
       </w:r>
       <w:r>
         <w:rPr>
           <w:b/>
           <w:bCs/>
         </w:rPr>
-        <w:t xml:space="preserve">Git</w:t>
-      </w:r>
-      <w:r>
-        <w:t xml:space="preserve"> es el sistema de control de versiones distribuido que mantiene un historial verificable de cambios y permite integrar y revertir incrementos de manera controlada (Chacon &amp; Straub, 2014), lo que resulta coherente con el ciclo iterativo de Scrum; </w:t>
+        <w:t xml:space="preserve">protocolo Web Push</w:t>
+      </w:r>
+      <w:r>
+        <w:t xml:space="preserve">, que define cómo un servidor de aplicación entrega un mensaje a un navegador a través de un servicio de push intermediario, sin mantener una conexión permanente con el dispositivo (Thomson, Damaggio &amp; Raymor, 2016). El servidor no conoce ni contacta al teléfono directamente: el navegador entrega a la aplicación una suscripción —una dirección única y dos claves de cifrado— y el servidor deposita en esa dirección un mensaje cifrado que solo el navegador suscriptor puede abrir. Para que el servicio de push acepte el envío, el servidor se identifica mediante el esquema </w:t>
       </w:r>
       <w:r>
         <w:rPr>
           <w:b/>
           <w:bCs/>
         </w:rPr>
-        <w:t xml:space="preserve">Visual Studio Code</w:t>
-      </w:r>
-      <w:r>
-        <w:t xml:space="preserve"> es el editor empleado, con depuración e integración nativa con Git.</w:t>
-      </w:r>
-    </w:p>
-    <w:p>
-      <w:pPr>
-        <w:pStyle w:val="Heading1"/>
-      </w:pPr>
-      <w:r>
-        <w:t xml:space="preserve">2.6. Calidad y seguridad del software</w:t>
-      </w:r>
-    </w:p>
-    <w:p>
-      <w:pPr>
-        <w:pStyle w:val="Heading2"/>
-      </w:pPr>
-      <w:r>
-        <w:t xml:space="preserve">2.6.1. Calidad de software y modelos de calidad</w:t>
-      </w:r>
-    </w:p>
-    <w:p>
-      <w:pPr>
-        <w:spacing w:after="160" w:line="360"/>
-        <w:ind w:firstLine="709"/>
-        <w:jc w:val="both"/>
-      </w:pPr>
-      <w:r>
-        <w:t xml:space="preserve">La calidad del software es el grado en que un producto satisface las necesidades explícitas e implícitas de sus interesados cuando se utiliza bajo condiciones especificadas (International Organization for Standardization, 2023). Las necesidades pueden ser implícitas —el usuario no las declara, pero su ausencia genera insatisfacción— y la calidad se predica respecto de un contexto de uso, por lo que no es una propiedad absoluta del producto.</w:t>
-      </w:r>
-    </w:p>
-    <w:p>
-      <w:pPr>
-        <w:spacing w:after="160" w:line="360"/>
-        <w:ind w:firstLine="709"/>
-        <w:jc w:val="both"/>
-      </w:pPr>
-      <w:r>
-        <w:t xml:space="preserve">Los primeros modelos jerárquicos de calidad fueron los de McCall, Richards y Walters (1977) y Boehm et al. (1978). El modelo de Boehm descompone la calidad en usos principales, componentes intermedios y componentes primitivos directamente medibles. Su valor histórico es indiscutible como antecedente de los modelos posteriores; sin embargo, para evaluar el presente sistema se adopta la norma internacional vigente, ISO/IEC 25010.</w:t>
-      </w:r>
-    </w:p>
-    <w:p>
-      <w:pPr>
-        <w:spacing w:after="160" w:line="360"/>
-        <w:ind w:firstLine="709"/>
-        <w:jc w:val="both"/>
-      </w:pPr>
-      <w:r>
-        <w:t xml:space="preserve">La norma ISO/IEC 25010, de la familia SQuaRE (</w:t>
-      </w:r>
-      <w:r>
-        <w:rPr>
-          <w:i/>
-          <w:iCs/>
-        </w:rPr>
-        <w:t xml:space="preserve">Systems and software Quality Requirements and Evaluation</w:t>
-      </w:r>
-      <w:r>
-        <w:t xml:space="preserve">), define el modelo de calidad del producto de software. En su revisión de 2023 comprende nueve características, cada una descompuesta en subcaracterísticas (Figura 7). Se adopta porque es el estándar vigente, porque sus características se corresponden con los atributos relevantes de un sistema web institucional y porque su estructura se complementa con la norma ISO/IEC 25023, que define métricas para medirlas (International Organization for Standardization, 2016). La Tabla 5 relaciona cada característica con el sistema.</w:t>
+        <w:t xml:space="preserve">VAPID</w:t>
+      </w:r>
+      <w:r>
+        <w:t xml:space="preserve">, que firma cada petición con un par de claves propio de la aplicación (Thomson &amp; Beverloo, 2017). La Figura 7 representa esta cadena.</w:t>
       </w:r>
     </w:p>
     <w:p>
@@ -4780,7 +5204,7 @@
           <w:sz w:val="22"/>
           <w:szCs w:val="22"/>
         </w:rPr>
-        <w:t xml:space="preserve">Figura 7: Modelo de calidad del producto ISO/IEC 25010:2023 (subcaracterísticas principales)</w:t>
+        <w:t xml:space="preserve">Figura 7: Cadena de entrega de una notificación push</w:t>
       </w:r>
     </w:p>
     <w:p>
@@ -4791,7 +5215,7 @@
       <w:r>
         <w:drawing>
           <wp:inline distT="0" distB="0" distL="0" distR="0">
-            <wp:extent cx="5715000" cy="2690758"/>
+            <wp:extent cx="5715000" cy="2176625"/>
             <wp:effectExtent t="0" r="0" b="0" l="0"/>
             <wp:docPr id="1" name="" descr="" title=""/>
             <wp:cNvGraphicFramePr>
@@ -4816,6 +5240,304 @@
                   <pic:spPr bwMode="auto">
                     <a:xfrm>
                       <a:off x="0" y="0"/>
+                      <a:ext cx="5715000" cy="2176625"/>
+                    </a:xfrm>
+                    <a:prstGeom prst="rect">
+                      <a:avLst/>
+                    </a:prstGeom>
+                  </pic:spPr>
+                </pic:pic>
+              </a:graphicData>
+            </a:graphic>
+          </wp:inline>
+        </w:drawing>
+      </w:r>
+    </w:p>
+    <w:p>
+      <w:pPr>
+        <w:spacing w:after="240"/>
+        <w:jc w:val="center"/>
+      </w:pPr>
+      <w:r>
+        <w:rPr>
+          <w:i/>
+          <w:iCs/>
+          <w:sz w:val="20"/>
+          <w:szCs w:val="20"/>
+        </w:rPr>
+        <w:t xml:space="preserve">Fuente: Elaboración propia con base en Thomson et al. (2016) y Thomson y Beverloo (2017).</w:t>
+      </w:r>
+    </w:p>
+    <w:p>
+      <w:pPr>
+        <w:spacing w:after="160" w:line="360"/>
+        <w:ind w:firstLine="709"/>
+        <w:jc w:val="both"/>
+      </w:pPr>
+      <w:r>
+        <w:t xml:space="preserve">Esta decisión tecnológica resuelve, dentro de la arquitectura web ya adoptada, el requisito planteado en la sección 2.1.4: hacer llegar el aviso al tutor sin depender de que este ingrese al sistema. Conviene precisar su alcance frente a la alternativa de una aplicación móvil nativa: la PWA se instala desde el propio navegador, no requiere distribución por una tienda de aplicaciones ni desarrollo separado para cada plataforma, y no exige exponer los datos mediante una interfaz de programación, puesto que comparte el mismo servidor y las mismas vistas que la aplicación web. A cambio, el soporte de las notificaciones push depende del navegador y del sistema operativo del usuario, y el aviso solo llega si este concedió el permiso correspondiente.</w:t>
+      </w:r>
+    </w:p>
+    <w:p>
+      <w:pPr>
+        <w:pStyle w:val="Heading2"/>
+      </w:pPr>
+      <w:r>
+        <w:t xml:space="preserve">2.5.6. Bibliotecas complementarias, despliegue y herramientas</w:t>
+      </w:r>
+    </w:p>
+    <w:p>
+      <w:pPr>
+        <w:spacing w:after="160" w:line="360"/>
+        <w:ind w:firstLine="709"/>
+        <w:jc w:val="both"/>
+      </w:pPr>
+      <w:r>
+        <w:rPr>
+          <w:b/>
+          <w:bCs/>
+        </w:rPr>
+        <w:t xml:space="preserve">ReportLab</w:t>
+      </w:r>
+      <w:r>
+        <w:t xml:space="preserve"> es la biblioteca de generación de documentos PDF empleada para emitir el boletín de calificaciones; </w:t>
+      </w:r>
+      <w:r>
+        <w:rPr>
+          <w:b/>
+          <w:bCs/>
+        </w:rPr>
+        <w:t xml:space="preserve">openpyxl</w:t>
+      </w:r>
+      <w:r>
+        <w:t xml:space="preserve"> genera las planillas en formato Excel que la Secretaría utiliza para la transcripción y el archivo; </w:t>
+      </w:r>
+      <w:r>
+        <w:rPr>
+          <w:b/>
+          <w:bCs/>
+        </w:rPr>
+        <w:t xml:space="preserve">Pillow</w:t>
+      </w:r>
+      <w:r>
+        <w:t xml:space="preserve"> es la biblioteca de procesamiento de imágenes requerida por Django para los campos de imagen; </w:t>
+      </w:r>
+      <w:r>
+        <w:rPr>
+          <w:b/>
+          <w:bCs/>
+        </w:rPr>
+        <w:t xml:space="preserve">pywebpush</w:t>
+      </w:r>
+      <w:r>
+        <w:t xml:space="preserve"> implementa el protocolo Web Push descrito en la sección anterior; y </w:t>
+      </w:r>
+      <w:r>
+        <w:rPr>
+          <w:b/>
+          <w:bCs/>
+        </w:rPr>
+        <w:t xml:space="preserve">python-decouple</w:t>
+      </w:r>
+      <w:r>
+        <w:t xml:space="preserve"> externaliza la configuración y las credenciales en un archivo de entorno excluido del control de versiones.</w:t>
+      </w:r>
+    </w:p>
+    <w:p>
+      <w:pPr>
+        <w:spacing w:after="160" w:line="360"/>
+        <w:ind w:firstLine="709"/>
+        <w:jc w:val="both"/>
+      </w:pPr>
+      <w:r>
+        <w:t xml:space="preserve">Para el despliegue, WSGI (</w:t>
+      </w:r>
+      <w:r>
+        <w:rPr>
+          <w:i/>
+          <w:iCs/>
+        </w:rPr>
+        <w:t xml:space="preserve">Web Server Gateway Interface</w:t>
+      </w:r>
+      <w:r>
+        <w:t xml:space="preserve">) es la especificación estándar de la interfaz entre un servidor web y una aplicación Python (Eby, 2010). El sistema se ejecuta tras </w:t>
+      </w:r>
+      <w:r>
+        <w:rPr>
+          <w:b/>
+          <w:bCs/>
+        </w:rPr>
+        <w:t xml:space="preserve">Gunicorn</w:t>
+      </w:r>
+      <w:r>
+        <w:t xml:space="preserve">, servidor de aplicación WSGI que atiende las peticiones mediante varios procesos de trabajo (Chesneau, 2026), y emplea </w:t>
+      </w:r>
+      <w:r>
+        <w:rPr>
+          <w:b/>
+          <w:bCs/>
+        </w:rPr>
+        <w:t xml:space="preserve">WhiteNoise</w:t>
+      </w:r>
+      <w:r>
+        <w:t xml:space="preserve"> para servir los archivos estáticos comprimidos y versionados desde el propio proceso de la aplicación, sin requerir un servidor web adicional dedicado a ese fin.</w:t>
+      </w:r>
+    </w:p>
+    <w:p>
+      <w:pPr>
+        <w:spacing w:after="160" w:line="360"/>
+        <w:ind w:firstLine="709"/>
+        <w:jc w:val="both"/>
+      </w:pPr>
+      <w:r>
+        <w:t xml:space="preserve">El sistema está preparado para ejecutarse tanto en un servidor de la institución como en una plataforma como servicio (PaaS), modalidad de cómputo en la nube en la que el proveedor administra el sistema operativo, el motor de ejecución y el escalado, y el desarrollador solo aporta la aplicación y su configuración (Mell &amp; Grance, 2011). Esta portabilidad se apoya en la metodología </w:t>
+      </w:r>
+      <w:r>
+        <w:rPr>
+          <w:i/>
+          <w:iCs/>
+        </w:rPr>
+        <w:t xml:space="preserve">twelve-factor app</w:t>
+      </w:r>
+      <w:r>
+        <w:t xml:space="preserve"> (Wiggins, 2017), cuyo tercer factor establece que la configuración que varía entre entornos —credenciales, cadena de conexión, dominios permitidos, umbrales operativos— debe residir en variables de entorno y no en el código. El sistema aplica este principio de manera uniforme: el mismo código se ejecuta en el equipo del colegio y en el servidor en la nube, y solo cambian las variables de entorno.</w:t>
+      </w:r>
+    </w:p>
+    <w:p>
+      <w:pPr>
+        <w:spacing w:after="160" w:line="360"/>
+        <w:ind w:firstLine="709"/>
+        <w:jc w:val="both"/>
+      </w:pPr>
+      <w:r>
+        <w:t xml:space="preserve">Finalmente, </w:t>
+      </w:r>
+      <w:r>
+        <w:rPr>
+          <w:b/>
+          <w:bCs/>
+        </w:rPr>
+        <w:t xml:space="preserve">Git</w:t>
+      </w:r>
+      <w:r>
+        <w:t xml:space="preserve"> es el sistema de control de versiones distribuido que mantiene un historial verificable de cambios y permite integrar y revertir incrementos de manera controlada (Chacon &amp; Straub, 2014), lo que resulta coherente con el ciclo iterativo de Scrum; </w:t>
+      </w:r>
+      <w:r>
+        <w:rPr>
+          <w:b/>
+          <w:bCs/>
+        </w:rPr>
+        <w:t xml:space="preserve">Visual Studio Code</w:t>
+      </w:r>
+      <w:r>
+        <w:t xml:space="preserve"> es el editor empleado, con depuración e integración nativa con Git.</w:t>
+      </w:r>
+    </w:p>
+    <w:p>
+      <w:pPr>
+        <w:pStyle w:val="Heading1"/>
+      </w:pPr>
+      <w:r>
+        <w:t xml:space="preserve">2.6. Calidad y seguridad del software</w:t>
+      </w:r>
+    </w:p>
+    <w:p>
+      <w:pPr>
+        <w:pStyle w:val="Heading2"/>
+      </w:pPr>
+      <w:r>
+        <w:t xml:space="preserve">2.6.1. Calidad de software y modelos de calidad</w:t>
+      </w:r>
+    </w:p>
+    <w:p>
+      <w:pPr>
+        <w:spacing w:after="160" w:line="360"/>
+        <w:ind w:firstLine="709"/>
+        <w:jc w:val="both"/>
+      </w:pPr>
+      <w:r>
+        <w:t xml:space="preserve">La calidad del software es el grado en que un producto satisface las necesidades explícitas e implícitas de sus interesados cuando se utiliza bajo condiciones especificadas (International Organization for Standardization, 2023). Las necesidades pueden ser implícitas —el usuario no las declara, pero su ausencia genera insatisfacción— y la calidad se predica respecto de un contexto de uso, por lo que no es una propiedad absoluta del producto.</w:t>
+      </w:r>
+    </w:p>
+    <w:p>
+      <w:pPr>
+        <w:spacing w:after="160" w:line="360"/>
+        <w:ind w:firstLine="709"/>
+        <w:jc w:val="both"/>
+      </w:pPr>
+      <w:r>
+        <w:t xml:space="preserve">Los primeros modelos jerárquicos de calidad fueron los de McCall, Richards y Walters (1977) y Boehm et al. (1978). El modelo de Boehm descompone la calidad en usos principales, componentes intermedios y componentes primitivos directamente medibles. Su valor histórico es indiscutible como antecedente de los modelos posteriores; sin embargo, para evaluar el presente sistema se adopta la norma internacional vigente, ISO/IEC 25010.</w:t>
+      </w:r>
+    </w:p>
+    <w:p>
+      <w:pPr>
+        <w:spacing w:after="160" w:line="360"/>
+        <w:ind w:firstLine="709"/>
+        <w:jc w:val="both"/>
+      </w:pPr>
+      <w:r>
+        <w:t xml:space="preserve">La norma ISO/IEC 25010, de la familia SQuaRE (</w:t>
+      </w:r>
+      <w:r>
+        <w:rPr>
+          <w:i/>
+          <w:iCs/>
+        </w:rPr>
+        <w:t xml:space="preserve">Systems and software Quality Requirements and Evaluation</w:t>
+      </w:r>
+      <w:r>
+        <w:t xml:space="preserve">), define el modelo de calidad del producto de software. En su revisión de 2023 comprende nueve características, cada una descompuesta en subcaracterísticas (Figura 8). Se adopta porque es el estándar vigente, porque sus características se corresponden con los atributos relevantes de un sistema web institucional y porque su estructura se complementa con la norma ISO/IEC 25023, que define métricas para medirlas (International Organization for Standardization, 2016). La Tabla 5 relaciona cada característica con el sistema.</w:t>
+      </w:r>
+    </w:p>
+    <w:p>
+      <w:pPr>
+        <w:keepNext/>
+        <w:spacing w:after="80" w:before="200"/>
+        <w:jc w:val="center"/>
+      </w:pPr>
+      <w:r>
+        <w:rPr>
+          <w:b/>
+          <w:bCs/>
+          <w:sz w:val="22"/>
+          <w:szCs w:val="22"/>
+        </w:rPr>
+        <w:t xml:space="preserve">Figura 8: Modelo de calidad del producto ISO/IEC 25010:2023 (subcaracterísticas principales)</w:t>
+      </w:r>
+    </w:p>
+    <w:p>
+      <w:pPr>
+        <w:keepNext/>
+        <w:jc w:val="center"/>
+      </w:pPr>
+      <w:r>
+        <w:drawing>
+          <wp:inline distT="0" distB="0" distL="0" distR="0">
+            <wp:extent cx="5715000" cy="2690758"/>
+            <wp:effectExtent t="0" r="0" b="0" l="0"/>
+            <wp:docPr id="1" name="" descr="" title=""/>
+            <wp:cNvGraphicFramePr>
+              <a:graphicFrameLocks xmlns:a="http://schemas.openxmlformats.org/drawingml/2006/main" noChangeAspect="1"/>
+            </wp:cNvGraphicFramePr>
+            <a:graphic xmlns:a="http://schemas.openxmlformats.org/drawingml/2006/main">
+              <a:graphicData uri="http://schemas.openxmlformats.org/drawingml/2006/picture">
+                <pic:pic xmlns:pic="http://schemas.openxmlformats.org/drawingml/2006/picture">
+                  <pic:nvPicPr>
+                    <pic:cNvPr id="0" name="" descr=""/>
+                    <pic:cNvPicPr>
+                      <a:picLocks noChangeAspect="1" noChangeArrowheads="1"/>
+                    </pic:cNvPicPr>
+                  </pic:nvPicPr>
+                  <pic:blipFill>
+                    <a:blip r:embed="rId15" cstate="none"/>
+                    <a:srcRect/>
+                    <a:stretch>
+                      <a:fillRect/>
+                    </a:stretch>
+                  </pic:blipFill>
+                  <pic:spPr bwMode="auto">
+                    <a:xfrm>
+                      <a:off x="0" y="0"/>
                       <a:ext cx="5715000" cy="2690758"/>
                     </a:xfrm>
                     <a:prstGeom prst="rect">
@@ -5142,7 +5864,7 @@
                 <w:sz w:val="20"/>
                 <w:szCs w:val="20"/>
               </w:rPr>
-              <w:t xml:space="preserve">Carga anticipada de relaciones, creación masiva de registros e índices parciales.</w:t>
+              <w:t xml:space="preserve">Carga anticipada de relaciones, creación masiva de registros, índices parciales y envío de avisos en segundo plano.</w:t>
             </w:r>
           </w:p>
         </w:tc>
@@ -5231,7 +5953,7 @@
                 <w:sz w:val="20"/>
                 <w:szCs w:val="20"/>
               </w:rPr>
-              <w:t xml:space="preserve">Centralizadores que alimentan la transcripción al SIE; acceso desde cualquier navegador.</w:t>
+              <w:t xml:space="preserve">Planillas en Excel y boletines en PDF que alimentan la transcripción al SIE; acceso desde cualquier navegador.</w:t>
             </w:r>
           </w:p>
         </w:tc>
@@ -5320,7 +6042,7 @@
                 <w:sz w:val="20"/>
                 <w:szCs w:val="20"/>
               </w:rPr>
-              <w:t xml:space="preserve">Interfaz responsiva; acceso de estudiantes y tutores con datos que ya poseen.</w:t>
+              <w:t xml:space="preserve">Interfaz responsiva e instalable como PWA; acceso de estudiantes y tutores con datos que ya poseen; avisos graduados por urgencia.</w:t>
             </w:r>
           </w:p>
         </w:tc>
@@ -5409,7 +6131,7 @@
                 <w:sz w:val="20"/>
                 <w:szCs w:val="20"/>
               </w:rPr>
-              <w:t xml:space="preserve">Restricciones en la base de datos y transacciones atómicas.</w:t>
+              <w:t xml:space="preserve">Restricciones en la base de datos, transacciones atómicas y respaldos automáticos verificados.</w:t>
             </w:r>
           </w:p>
         </w:tc>
@@ -5676,7 +6398,7 @@
                 <w:sz w:val="20"/>
                 <w:szCs w:val="20"/>
               </w:rPr>
-              <w:t xml:space="preserve">ORM independiente del motor, configuración por variables de entorno.</w:t>
+              <w:t xml:space="preserve">ORM independiente del motor y configuración por variables de entorno: el mismo código corre en el servidor del colegio y en la nube.</w:t>
             </w:r>
           </w:p>
         </w:tc>
@@ -5765,7 +6487,7 @@
                 <w:sz w:val="20"/>
                 <w:szCs w:val="20"/>
               </w:rPr>
-              <w:t xml:space="preserve">Aplicabilidad limitada; se contempla en la salvaguarda del expediente académico.</w:t>
+              <w:t xml:space="preserve">Aplicabilidad limitada; se contempla en la salvaguarda del expediente académico, cuya pérdida afectaría la continuidad educativa.</w:t>
             </w:r>
           </w:p>
         </w:tc>
@@ -5872,7 +6594,7 @@
         <w:pStyle w:val="Heading2"/>
       </w:pPr>
       <w:r>
-        <w:t xml:space="preserve">2.6.3. Seguridad de la información</w:t>
+        <w:t xml:space="preserve">2.6.3. Respaldo y continuidad operativa</w:t>
       </w:r>
     </w:p>
     <w:p>
@@ -5882,37 +6604,27 @@
         <w:jc w:val="both"/>
       </w:pPr>
       <w:r>
-        <w:t xml:space="preserve">La norma ISO/IEC 27000 define la seguridad de la información como la preservación de su </w:t>
+        <w:t xml:space="preserve">Cuando un sistema pasa a custodiar el expediente académico de una institución, su pérdida deja de ser un inconveniente técnico para convertirse en un problema legal y pedagógico: las calificaciones de un estudiante son el respaldo de su trayectoria escolar. La planificación de contingencia (NIST, 2010) define dos parámetros para dimensionar esta protección: el </w:t>
       </w:r>
       <w:r>
         <w:rPr>
           <w:b/>
           <w:bCs/>
         </w:rPr>
-        <w:t xml:space="preserve">confidencialidad</w:t>
-      </w:r>
-      <w:r>
-        <w:t xml:space="preserve">, </w:t>
+        <w:t xml:space="preserve">objetivo de punto de recuperación</w:t>
+      </w:r>
+      <w:r>
+        <w:t xml:space="preserve"> (RPO), que expresa cuánta información se admite perder, medida como el tiempo transcurrido desde el último respaldo utilizable; y el </w:t>
       </w:r>
       <w:r>
         <w:rPr>
           <w:b/>
           <w:bCs/>
         </w:rPr>
-        <w:t xml:space="preserve">integridad</w:t>
-      </w:r>
-      <w:r>
-        <w:t xml:space="preserve"> y </w:t>
-      </w:r>
-      <w:r>
-        <w:rPr>
-          <w:b/>
-          <w:bCs/>
-        </w:rPr>
-        <w:t xml:space="preserve">disponibilidad</w:t>
-      </w:r>
-      <w:r>
-        <w:t xml:space="preserve"> (International Organization for Standardization, 2018). En el sistema, la confidencialidad se garantiza mediante el control de acceso por roles y la verificación de titularidad del recurso —un tutor accede solo a la información de sus hijos—; la integridad, mediante restricciones de base de datos, validadores de rango y transacciones atómicas; y la disponibilidad, mediante la arquitectura web centralizada.</w:t>
+        <w:t xml:space="preserve">objetivo de tiempo de recuperación</w:t>
+      </w:r>
+      <w:r>
+        <w:t xml:space="preserve"> (RTO), que expresa en cuánto tiempo debe restablecerse el servicio.</w:t>
       </w:r>
     </w:p>
     <w:p>
@@ -5922,7 +6634,125 @@
         <w:jc w:val="both"/>
       </w:pPr>
       <w:r>
+        <w:t xml:space="preserve">De ambos parámetros se desprenden tres exigencias que orientan el diseño del respaldo. La primera es la </w:t>
+      </w:r>
+      <w:r>
+        <w:rPr>
+          <w:b/>
+          <w:bCs/>
+        </w:rPr>
+        <w:t xml:space="preserve">periodicidad</w:t>
+      </w:r>
+      <w:r>
+        <w:t xml:space="preserve">: un respaldo diario acota el RPO a la jornada en curso, que en este dominio equivale como máximo a un día de asistencia y a las notas cargadas esa tarde. La segunda es la </w:t>
+      </w:r>
+      <w:r>
+        <w:rPr>
+          <w:b/>
+          <w:bCs/>
+        </w:rPr>
+        <w:t xml:space="preserve">copia fuera del equipo</w:t>
+      </w:r>
+      <w:r>
+        <w:t xml:space="preserve">, pues un respaldo almacenado únicamente en el mismo disco que la base de datos no protege frente a la falla de ese disco ni frente a un cifrado malicioso. La tercera, y la más olvidada, es la </w:t>
+      </w:r>
+      <w:r>
+        <w:rPr>
+          <w:b/>
+          <w:bCs/>
+        </w:rPr>
+        <w:t xml:space="preserve">verificación</w:t>
+      </w:r>
+      <w:r>
+        <w:t xml:space="preserve">: un respaldo que nunca se restauró es una hipótesis, no una garantía, de modo que la prueba periódica de restauración forma parte del procedimiento y no de la buena voluntad. A ello se suma el cifrado de las copias, dado que un archivo de respaldo contiene exactamente los mismos datos personales que la base de datos en producción.</w:t>
+      </w:r>
+    </w:p>
+    <w:p>
+      <w:pPr>
+        <w:pStyle w:val="Heading2"/>
+      </w:pPr>
+      <w:r>
+        <w:t xml:space="preserve">2.6.4. Seguridad de la información</w:t>
+      </w:r>
+    </w:p>
+    <w:p>
+      <w:pPr>
+        <w:spacing w:after="160" w:line="360"/>
+        <w:ind w:firstLine="709"/>
+        <w:jc w:val="both"/>
+      </w:pPr>
+      <w:r>
+        <w:t xml:space="preserve">La norma ISO/IEC 27000 define la seguridad de la información como la preservación de su </w:t>
+      </w:r>
+      <w:r>
+        <w:rPr>
+          <w:b/>
+          <w:bCs/>
+        </w:rPr>
+        <w:t xml:space="preserve">confidencialidad</w:t>
+      </w:r>
+      <w:r>
+        <w:t xml:space="preserve">, </w:t>
+      </w:r>
+      <w:r>
+        <w:rPr>
+          <w:b/>
+          <w:bCs/>
+        </w:rPr>
+        <w:t xml:space="preserve">integridad</w:t>
+      </w:r>
+      <w:r>
+        <w:t xml:space="preserve"> y </w:t>
+      </w:r>
+      <w:r>
+        <w:rPr>
+          <w:b/>
+          <w:bCs/>
+        </w:rPr>
+        <w:t xml:space="preserve">disponibilidad</w:t>
+      </w:r>
+      <w:r>
+        <w:t xml:space="preserve"> (International Organization for Standardization, 2018). En el sistema, la confidencialidad se garantiza mediante el control de acceso por roles y la verificación de titularidad del recurso —un tutor accede solo a la información de sus hijos—; la integridad, mediante restricciones de base de datos, validadores de rango y transacciones atómicas; y la disponibilidad, mediante la arquitectura web centralizada.</w:t>
+      </w:r>
+    </w:p>
+    <w:p>
+      <w:pPr>
+        <w:spacing w:after="160" w:line="360"/>
+        <w:ind w:firstLine="709"/>
+        <w:jc w:val="both"/>
+      </w:pPr>
+      <w:r>
         <w:t xml:space="preserve">En el ámbito de las aplicaciones web, el proyecto OWASP Top 10 identifica los riesgos de seguridad más críticos; en su edición 2025, la pérdida del control de acceso ocupa el primer lugar y la inyección figura entre las cinco primeras categorías (OWASP Foundation, 2025). Django incorpora protecciones nativas contra estas y otras vulnerabilidades frecuentes (Django Software Foundation, 2026), resumidas en la Tabla 6.</w:t>
+      </w:r>
+    </w:p>
+    <w:p>
+      <w:pPr>
+        <w:spacing w:after="160" w:line="360"/>
+        <w:ind w:firstLine="709"/>
+        <w:jc w:val="both"/>
+      </w:pPr>
+      <w:r>
+        <w:t xml:space="preserve">A los mecanismos de aplicación se suma la protección del canal. El tráfico entre el navegador y el servidor viaja cifrado mediante HTTPS, y el encabezado </w:t>
+      </w:r>
+      <w:r>
+        <w:rPr>
+          <w:b/>
+          <w:bCs/>
+        </w:rPr>
+        <w:t xml:space="preserve">HSTS</w:t>
+      </w:r>
+      <w:r>
+        <w:t xml:space="preserve"> (</w:t>
+      </w:r>
+      <w:r>
+        <w:rPr>
+          <w:i/>
+          <w:iCs/>
+        </w:rPr>
+        <w:t xml:space="preserve">HTTP Strict Transport Security</w:t>
+      </w:r>
+      <w:r>
+        <w:t xml:space="preserve">) instruye al navegador para que, durante un período determinado, se niegue a contactar al sitio por un canal no cifrado, cerrando la ventana en que una conexión inicial podría ser interceptada (Hodges, Jackson &amp; Barth, 2012). Complementariamente, las cookies de sesión se marcan como seguras y accesibles solo por el servidor, y la sesión expira tras un período de inactividad.</w:t>
       </w:r>
     </w:p>
     <w:p>
@@ -6526,10 +7356,10 @@
     </w:p>
     <w:p>
       <w:pPr>
-        <w:pStyle w:val="Heading1"/>
-      </w:pPr>
-      <w:r>
-        <w:t xml:space="preserve">2.7. Síntesis del capítulo</w:t>
+        <w:pStyle w:val="Heading2"/>
+      </w:pPr>
+      <w:r>
+        <w:t xml:space="preserve">2.6.5. Protección de datos personales</w:t>
       </w:r>
     </w:p>
     <w:p>
@@ -6539,7 +7369,85 @@
         <w:jc w:val="both"/>
       </w:pPr>
       <w:r>
-        <w:t xml:space="preserve">El capítulo ha establecido la fundamentación del Sistema de Seguimiento Académico. Del dominio educativo se derivaron el vocabulario y las reglas que el sistema codifica, con atención a la Ley 070, a la evidencia sobre alerta temprana y a la delimitación respecto del SIE. De la Ingeniería de Software se tomaron el modelo de proceso, la arquitectura en capas y el lenguaje de modelado; de Scrum, el ciclo empírico de inspección y adaptación. Del análisis tecnológico se justificó cada componente del stack, sustituyendo MySQL por PostgreSQL con base en criterios técnicos verificables. Finalmente, ISO/IEC 25010 provee el marco bajo el cual el producto será evaluado, y los principios de seguridad de la información orientan la protección de los datos académicos.</w:t>
+        <w:t xml:space="preserve">El sistema trata datos personales de menores de edad: nombres, documentos de identidad, fotografías, domicilios, datos de contacto del tutor y el historial académico completo. Bolivia no cuenta aún con una ley general de protección de datos personales; la materia se rige por el derecho a la privacidad y a la protección de los datos personales reconocido en la Constitución Política del Estado (Estado Plurinacional de Bolivia, 2009, art. 21), por la acción de protección de privacidad, y por las disposiciones sobre datos personales y documento digital de la Ley N.º 164 y su reglamento (Estado Plurinacional de Bolivia, 2011; Decreto Supremo N.º 1793, 2013). La AGETIC ha impulsado además un anteproyecto de ley específico (AGETIC, 2024), lo que anticipa un marco más exigente a corto plazo.</w:t>
+      </w:r>
+    </w:p>
+    <w:p>
+      <w:pPr>
+        <w:spacing w:after="160" w:line="360"/>
+        <w:ind w:firstLine="709"/>
+        <w:jc w:val="both"/>
+      </w:pPr>
+      <w:r>
+        <w:t xml:space="preserve">A falta de una norma nacional detallada, el diseño se apoya en los principios de privacidad reconocidos internacionalmente (International Organization for Standardization, 2011), de los cuales tres gobiernan decisiones concretas de este sistema. El principio de </w:t>
+      </w:r>
+      <w:r>
+        <w:rPr>
+          <w:b/>
+          <w:bCs/>
+        </w:rPr>
+        <w:t xml:space="preserve">limitación de la finalidad</w:t>
+      </w:r>
+      <w:r>
+        <w:t xml:space="preserve"> exige que los datos se usen solo para el propósito por el cual se recogieron, lo que en términos de diseño se traduce en el control de acceso por roles: un tutor accede a la información de sus hijos y no a la del curso. El principio de </w:t>
+      </w:r>
+      <w:r>
+        <w:rPr>
+          <w:b/>
+          <w:bCs/>
+        </w:rPr>
+        <w:t xml:space="preserve">minimización</w:t>
+      </w:r>
+      <w:r>
+        <w:t xml:space="preserve"> establece que no debe recogerse más información que la necesaria para esa finalidad. Y el principio de </w:t>
+      </w:r>
+      <w:r>
+        <w:rPr>
+          <w:b/>
+          <w:bCs/>
+        </w:rPr>
+        <w:t xml:space="preserve">transparencia</w:t>
+      </w:r>
+      <w:r>
+        <w:t xml:space="preserve"> exige que las personas puedan conocer qué se guarda sobre ellas, lo que justifica que el sistema publique una página de privacidad accesible sin haber iniciado sesión, de modo que un padre pueda leerla antes de tener cuenta.</w:t>
+      </w:r>
+    </w:p>
+    <w:p>
+      <w:pPr>
+        <w:spacing w:after="160" w:line="360"/>
+        <w:ind w:firstLine="709"/>
+        <w:jc w:val="both"/>
+      </w:pPr>
+      <w:r>
+        <w:t xml:space="preserve">De estos principios se desprende también el tratamiento de los datos en entornos que no son de producción. Para demostraciones, capacitaciones y pruebas no debe emplearse la base real: la </w:t>
+      </w:r>
+      <w:r>
+        <w:rPr>
+          <w:b/>
+          <w:bCs/>
+        </w:rPr>
+        <w:t xml:space="preserve">anonimización</w:t>
+      </w:r>
+      <w:r>
+        <w:t xml:space="preserve"> —sustitución irreversible de los datos identificatorios por valores ficticios— permite conservar la estructura y el volumen de la información sin exponer la identidad de ningún estudiante (International Organization for Standardization, 2011).</w:t>
+      </w:r>
+    </w:p>
+    <w:p>
+      <w:pPr>
+        <w:pStyle w:val="Heading1"/>
+      </w:pPr>
+      <w:r>
+        <w:t xml:space="preserve">2.7. Síntesis del capítulo</w:t>
+      </w:r>
+    </w:p>
+    <w:p>
+      <w:pPr>
+        <w:spacing w:after="160" w:line="360"/>
+        <w:ind w:firstLine="709"/>
+        <w:jc w:val="both"/>
+      </w:pPr>
+      <w:r>
+        <w:t xml:space="preserve">El capítulo ha establecido la fundamentación del Sistema de Seguimiento Académico. Del dominio educativo se derivaron el vocabulario y las reglas que el sistema codifica, con atención a la Ley 070, a la evidencia sobre alerta temprana y a la delimitación respecto del SIE. De la Ingeniería de Software se tomaron el modelo de proceso, la arquitectura en capas y el lenguaje de modelado; de Scrum, el ciclo empírico de inspección y adaptación. Del análisis tecnológico se justificó cada componente del stack, sustituyendo MySQL por PostgreSQL con base en criterios técnicos verificables. Finalmente, ISO/IEC 25010 provee el marco bajo el cual el producto será evaluado, mientras que los criterios de continuidad operativa, seguridad y protección de datos personales orientan la custodia del expediente académico de los estudiantes.</w:t>
       </w:r>
     </w:p>
     <w:p>
@@ -6561,17 +7469,17 @@
         <w:ind w:left="709" w:hanging="709"/>
       </w:pPr>
       <w:r>
-        <w:t xml:space="preserve">Balfanz, R., Herzog, L., &amp; Mac Iver, D. J. (2007). Preventing student disengagement and keeping students on the graduation path in urban middle-grades schools: Early identification and effective interventions. </w:t>
+        <w:t xml:space="preserve">AGETIC. (2024). </w:t>
       </w:r>
       <w:r>
         <w:rPr>
           <w:i/>
           <w:iCs/>
         </w:rPr>
-        <w:t xml:space="preserve">Educational Psychologist, 42</w:t>
-      </w:r>
-      <w:r>
-        <w:t xml:space="preserve">(4), 223–235. https://doi.org/10.1080/00461520701621079</w:t>
+        <w:t xml:space="preserve">Anteproyecto de Ley de Protección de Datos Personales</w:t>
+      </w:r>
+      <w:r>
+        <w:t xml:space="preserve">. Agencia de Gobierno Electrónico y Tecnologías de Información y Comunicación, Estado Plurinacional de Bolivia. https://agetic.gob.bo/</w:t>
       </w:r>
     </w:p>
     <w:p>
@@ -6580,17 +7488,17 @@
         <w:ind w:left="709" w:hanging="709"/>
       </w:pPr>
       <w:r>
-        <w:t xml:space="preserve">Bass, L., Clements, P., &amp; Kazman, R. (2012). </w:t>
+        <w:t xml:space="preserve">Ancker, J. S., Edwards, A., Nosal, S., Hauser, D., Mauer, E., &amp; Kaushal, R. (2017). Effects of workload, work complexity, and repeated alerts on alert fatigue in a clinical decision support system. </w:t>
       </w:r>
       <w:r>
         <w:rPr>
           <w:i/>
           <w:iCs/>
         </w:rPr>
-        <w:t xml:space="preserve">Software architecture in practice</w:t>
-      </w:r>
-      <w:r>
-        <w:t xml:space="preserve"> (3rd ed.). Addison-Wesley.</w:t>
+        <w:t xml:space="preserve">BMC Medical Informatics and Decision Making, 17</w:t>
+      </w:r>
+      <w:r>
+        <w:t xml:space="preserve">(36). https://doi.org/10.1186/s12911-017-0430-8</w:t>
       </w:r>
     </w:p>
     <w:p>
@@ -6599,17 +7507,17 @@
         <w:ind w:left="709" w:hanging="709"/>
       </w:pPr>
       <w:r>
-        <w:t xml:space="preserve">Beck, K., Beedle, M., van Bennekum, A., Cockburn, A., Cunningham, W., Fowler, M., … Thomas, D. (2001). </w:t>
+        <w:t xml:space="preserve">Ater, T. (2017). </w:t>
       </w:r>
       <w:r>
         <w:rPr>
           <w:i/>
           <w:iCs/>
         </w:rPr>
-        <w:t xml:space="preserve">Manifiesto por el Desarrollo Ágil de Software</w:t>
-      </w:r>
-      <w:r>
-        <w:t xml:space="preserve">. https://agilemanifesto.org/iso/es/manifesto.html</w:t>
+        <w:t xml:space="preserve">Building progressive web apps: Bringing the power of native to the browser</w:t>
+      </w:r>
+      <w:r>
+        <w:t xml:space="preserve">. O'Reilly Media.</w:t>
       </w:r>
     </w:p>
     <w:p>
@@ -6618,17 +7526,17 @@
         <w:ind w:left="709" w:hanging="709"/>
       </w:pPr>
       <w:r>
-        <w:t xml:space="preserve">Berzal, F., Cortijo, F. J., &amp; Cubero, J. C. (2005). </w:t>
+        <w:t xml:space="preserve">Balfanz, R., Herzog, L., &amp; Mac Iver, D. J. (2007). Preventing student disengagement and keeping students on the graduation path in urban middle-grades schools: Early identification and effective interventions. </w:t>
       </w:r>
       <w:r>
         <w:rPr>
           <w:i/>
           <w:iCs/>
         </w:rPr>
-        <w:t xml:space="preserve">Desarrollo profesional de aplicaciones web con ASP.NET</w:t>
-      </w:r>
-      <w:r>
-        <w:t xml:space="preserve">. iKor Consulting.</w:t>
+        <w:t xml:space="preserve">Educational Psychologist, 42</w:t>
+      </w:r>
+      <w:r>
+        <w:t xml:space="preserve">(4), 223–235. https://doi.org/10.1080/00461520701621079</w:t>
       </w:r>
     </w:p>
     <w:p>
@@ -6637,17 +7545,17 @@
         <w:ind w:left="709" w:hanging="709"/>
       </w:pPr>
       <w:r>
-        <w:t xml:space="preserve">Black, P., &amp; Wiliam, D. (1998). Assessment and classroom learning. </w:t>
+        <w:t xml:space="preserve">Bass, L., Clements, P., &amp; Kazman, R. (2012). </w:t>
       </w:r>
       <w:r>
         <w:rPr>
           <w:i/>
           <w:iCs/>
         </w:rPr>
-        <w:t xml:space="preserve">Assessment in Education: Principles, Policy &amp; Practice, 5</w:t>
-      </w:r>
-      <w:r>
-        <w:t xml:space="preserve">(1), 7–74. https://doi.org/10.1080/0969595980050102</w:t>
+        <w:t xml:space="preserve">Software architecture in practice</w:t>
+      </w:r>
+      <w:r>
+        <w:t xml:space="preserve"> (3rd ed.). Addison-Wesley.</w:t>
       </w:r>
     </w:p>
     <w:p>
@@ -6656,17 +7564,17 @@
         <w:ind w:left="709" w:hanging="709"/>
       </w:pPr>
       <w:r>
-        <w:t xml:space="preserve">Boehm, B. W., Brown, J. R., Kaspar, H., Lipow, M., MacLeod, G. J., &amp; Merritt, M. J. (1978). </w:t>
+        <w:t xml:space="preserve">Beck, K., Beedle, M., van Bennekum, A., Cockburn, A., Cunningham, W., Fowler, M., … Thomas, D. (2001). </w:t>
       </w:r>
       <w:r>
         <w:rPr>
           <w:i/>
           <w:iCs/>
         </w:rPr>
-        <w:t xml:space="preserve">Characteristics of software quality</w:t>
-      </w:r>
-      <w:r>
-        <w:t xml:space="preserve">. North-Holland.</w:t>
+        <w:t xml:space="preserve">Manifiesto por el Desarrollo Ágil de Software</w:t>
+      </w:r>
+      <w:r>
+        <w:t xml:space="preserve">. https://agilemanifesto.org/iso/es/manifesto.html</w:t>
       </w:r>
     </w:p>
     <w:p>
@@ -6675,17 +7583,17 @@
         <w:ind w:left="709" w:hanging="709"/>
       </w:pPr>
       <w:r>
-        <w:t xml:space="preserve">Booch, G., Rumbaugh, J., &amp; Jacobson, I. (2006). </w:t>
+        <w:t xml:space="preserve">Berzal, F., Cortijo, F. J., &amp; Cubero, J. C. (2005). </w:t>
       </w:r>
       <w:r>
         <w:rPr>
           <w:i/>
           <w:iCs/>
         </w:rPr>
-        <w:t xml:space="preserve">El lenguaje unificado de modelado: Guía del usuario</w:t>
-      </w:r>
-      <w:r>
-        <w:t xml:space="preserve"> (2.ª ed.). Pearson Addison-Wesley.</w:t>
+        <w:t xml:space="preserve">Desarrollo profesional de aplicaciones web con ASP.NET</w:t>
+      </w:r>
+      <w:r>
+        <w:t xml:space="preserve">. iKor Consulting.</w:t>
       </w:r>
     </w:p>
     <w:p>
@@ -6694,17 +7602,17 @@
         <w:ind w:left="709" w:hanging="709"/>
       </w:pPr>
       <w:r>
-        <w:t xml:space="preserve">Bootstrap Team. (2026). </w:t>
+        <w:t xml:space="preserve">Black, P., &amp; Wiliam, D. (1998). Assessment and classroom learning. </w:t>
       </w:r>
       <w:r>
         <w:rPr>
           <w:i/>
           <w:iCs/>
         </w:rPr>
-        <w:t xml:space="preserve">Bootstrap 5 documentation</w:t>
-      </w:r>
-      <w:r>
-        <w:t xml:space="preserve">. https://getbootstrap.com/docs/</w:t>
+        <w:t xml:space="preserve">Assessment in Education: Principles, Policy &amp; Practice, 5</w:t>
+      </w:r>
+      <w:r>
+        <w:t xml:space="preserve">(1), 7–74. https://doi.org/10.1080/0969595980050102</w:t>
       </w:r>
     </w:p>
     <w:p>
@@ -6713,17 +7621,17 @@
         <w:ind w:left="709" w:hanging="709"/>
       </w:pPr>
       <w:r>
-        <w:t xml:space="preserve">Bowers, A. J., Sprott, R., &amp; Taff, S. A. (2013). Do we know who will drop out? A review of the predictors of dropping out of high school: Precision, sensitivity, and specificity. </w:t>
+        <w:t xml:space="preserve">Boehm, B. W., Brown, J. R., Kaspar, H., Lipow, M., MacLeod, G. J., &amp; Merritt, M. J. (1978). </w:t>
       </w:r>
       <w:r>
         <w:rPr>
           <w:i/>
           <w:iCs/>
         </w:rPr>
-        <w:t xml:space="preserve">The High School Journal, 96</w:t>
-      </w:r>
-      <w:r>
-        <w:t xml:space="preserve">(2), 77–100. https://doi.org/10.1353/hsj.2013.0000</w:t>
+        <w:t xml:space="preserve">Characteristics of software quality</w:t>
+      </w:r>
+      <w:r>
+        <w:t xml:space="preserve">. North-Holland.</w:t>
       </w:r>
     </w:p>
     <w:p>
@@ -6732,17 +7640,17 @@
         <w:ind w:left="709" w:hanging="709"/>
       </w:pPr>
       <w:r>
-        <w:t xml:space="preserve">Chacon, S., &amp; Straub, B. (2014). </w:t>
+        <w:t xml:space="preserve">Booch, G., Rumbaugh, J., &amp; Jacobson, I. (2006). </w:t>
       </w:r>
       <w:r>
         <w:rPr>
           <w:i/>
           <w:iCs/>
         </w:rPr>
-        <w:t xml:space="preserve">Pro Git</w:t>
-      </w:r>
-      <w:r>
-        <w:t xml:space="preserve"> (2nd ed.). Apress. https://git-scm.com/book/es/v2</w:t>
+        <w:t xml:space="preserve">El lenguaje unificado de modelado: Guía del usuario</w:t>
+      </w:r>
+      <w:r>
+        <w:t xml:space="preserve"> (2.ª ed.). Pearson Addison-Wesley.</w:t>
       </w:r>
     </w:p>
     <w:p>
@@ -6751,17 +7659,17 @@
         <w:ind w:left="709" w:hanging="709"/>
       </w:pPr>
       <w:r>
-        <w:t xml:space="preserve">Chen, P. P. (1976). The entity-relationship model: Toward a unified view of data. </w:t>
+        <w:t xml:space="preserve">Bootstrap Team. (2026). </w:t>
       </w:r>
       <w:r>
         <w:rPr>
           <w:i/>
           <w:iCs/>
         </w:rPr>
-        <w:t xml:space="preserve">ACM Transactions on Database Systems, 1</w:t>
-      </w:r>
-      <w:r>
-        <w:t xml:space="preserve">(1), 9–36. https://doi.org/10.1145/320434.320440</w:t>
+        <w:t xml:space="preserve">Bootstrap 5 documentation</w:t>
+      </w:r>
+      <w:r>
+        <w:t xml:space="preserve">. https://getbootstrap.com/docs/</w:t>
       </w:r>
     </w:p>
     <w:p>
@@ -6770,17 +7678,17 @@
         <w:ind w:left="709" w:hanging="709"/>
       </w:pPr>
       <w:r>
-        <w:t xml:space="preserve">Codd, E. F. (1970). A relational model of data for large shared data banks. </w:t>
+        <w:t xml:space="preserve">Bowers, A. J., Sprott, R., &amp; Taff, S. A. (2013). Do we know who will drop out? A review of the predictors of dropping out of high school: Precision, sensitivity, and specificity. </w:t>
       </w:r>
       <w:r>
         <w:rPr>
           <w:i/>
           <w:iCs/>
         </w:rPr>
-        <w:t xml:space="preserve">Communications of the ACM, 13</w:t>
-      </w:r>
-      <w:r>
-        <w:t xml:space="preserve">(6), 377–387. https://doi.org/10.1145/362384.362685</w:t>
+        <w:t xml:space="preserve">The High School Journal, 96</w:t>
+      </w:r>
+      <w:r>
+        <w:t xml:space="preserve">(2), 77–100. https://doi.org/10.1353/hsj.2013.0000</w:t>
       </w:r>
     </w:p>
     <w:p>
@@ -6789,17 +7697,17 @@
         <w:ind w:left="709" w:hanging="709"/>
       </w:pPr>
       <w:r>
-        <w:t xml:space="preserve">Cohn, M. (2004). </w:t>
+        <w:t xml:space="preserve">Chacon, S., &amp; Straub, B. (2014). </w:t>
       </w:r>
       <w:r>
         <w:rPr>
           <w:i/>
           <w:iCs/>
         </w:rPr>
-        <w:t xml:space="preserve">User stories applied: For agile software development</w:t>
-      </w:r>
-      <w:r>
-        <w:t xml:space="preserve">. Addison-Wesley.</w:t>
+        <w:t xml:space="preserve">Pro Git</w:t>
+      </w:r>
+      <w:r>
+        <w:t xml:space="preserve"> (2nd ed.). Apress. https://git-scm.com/book/es/v2</w:t>
       </w:r>
     </w:p>
     <w:p>
@@ -6808,17 +7716,17 @@
         <w:ind w:left="709" w:hanging="709"/>
       </w:pPr>
       <w:r>
-        <w:t xml:space="preserve">Django Software Foundation. (2026). </w:t>
+        <w:t xml:space="preserve">Chen, P. P. (1976). The entity-relationship model: Toward a unified view of data. </w:t>
       </w:r>
       <w:r>
         <w:rPr>
           <w:i/>
           <w:iCs/>
         </w:rPr>
-        <w:t xml:space="preserve">Django documentation</w:t>
-      </w:r>
-      <w:r>
-        <w:t xml:space="preserve"> (Versión 6.1). https://docs.djangoproject.com/en/6.1/</w:t>
+        <w:t xml:space="preserve">ACM Transactions on Database Systems, 1</w:t>
+      </w:r>
+      <w:r>
+        <w:t xml:space="preserve">(1), 9–36. https://doi.org/10.1145/320434.320440</w:t>
       </w:r>
     </w:p>
     <w:p>
@@ -6827,17 +7735,17 @@
         <w:ind w:left="709" w:hanging="709"/>
       </w:pPr>
       <w:r>
-        <w:t xml:space="preserve">Eby, P. J. (2010). </w:t>
+        <w:t xml:space="preserve">Chesneau, B. (2026). </w:t>
       </w:r>
       <w:r>
         <w:rPr>
           <w:i/>
           <w:iCs/>
         </w:rPr>
-        <w:t xml:space="preserve">PEP 3333 – Python Web Server Gateway Interface v1.0.1</w:t>
-      </w:r>
-      <w:r>
-        <w:t xml:space="preserve">. Python Software Foundation. https://peps.python.org/pep-3333/</w:t>
+        <w:t xml:space="preserve">Gunicorn: WSGI HTTP server for UNIX — Documentation</w:t>
+      </w:r>
+      <w:r>
+        <w:t xml:space="preserve">. https://docs.gunicorn.org/</w:t>
       </w:r>
     </w:p>
     <w:p>
@@ -6846,17 +7754,17 @@
         <w:ind w:left="709" w:hanging="709"/>
       </w:pPr>
       <w:r>
-        <w:t xml:space="preserve">Edel Navarro, R. (2003). El rendimiento académico: Concepto, investigación y desarrollo. </w:t>
+        <w:t xml:space="preserve">Codd, E. F. (1970). A relational model of data for large shared data banks. </w:t>
       </w:r>
       <w:r>
         <w:rPr>
           <w:i/>
           <w:iCs/>
         </w:rPr>
-        <w:t xml:space="preserve">REICE. Revista Iberoamericana sobre Calidad, Eficacia y Cambio en Educación, 1</w:t>
-      </w:r>
-      <w:r>
-        <w:t xml:space="preserve">(2).</w:t>
+        <w:t xml:space="preserve">Communications of the ACM, 13</w:t>
+      </w:r>
+      <w:r>
+        <w:t xml:space="preserve">(6), 377–387. https://doi.org/10.1145/362384.362685</w:t>
       </w:r>
     </w:p>
     <w:p>
@@ -6865,17 +7773,17 @@
         <w:ind w:left="709" w:hanging="709"/>
       </w:pPr>
       <w:r>
-        <w:t xml:space="preserve">Elmasri, R., &amp; Navathe, S. B. (2011). </w:t>
+        <w:t xml:space="preserve">Cohn, M. (2004). </w:t>
       </w:r>
       <w:r>
         <w:rPr>
           <w:i/>
           <w:iCs/>
         </w:rPr>
-        <w:t xml:space="preserve">Fundamentals of database systems</w:t>
-      </w:r>
-      <w:r>
-        <w:t xml:space="preserve"> (6th ed.). Addison-Wesley.</w:t>
+        <w:t xml:space="preserve">User stories applied: For agile software development</w:t>
+      </w:r>
+      <w:r>
+        <w:t xml:space="preserve">. Addison-Wesley.</w:t>
       </w:r>
     </w:p>
     <w:p>
@@ -6884,17 +7792,17 @@
         <w:ind w:left="709" w:hanging="709"/>
       </w:pPr>
       <w:r>
-        <w:t xml:space="preserve">Estado Plurinacional de Bolivia. (2010). </w:t>
+        <w:t xml:space="preserve">Django Software Foundation. (2026). </w:t>
       </w:r>
       <w:r>
         <w:rPr>
           <w:i/>
           <w:iCs/>
         </w:rPr>
-        <w:t xml:space="preserve">Ley N.º 070 de la Educación «Avelino Siñani – Elizardo Pérez»</w:t>
-      </w:r>
-      <w:r>
-        <w:t xml:space="preserve">. Gaceta Oficial de Bolivia.</w:t>
+        <w:t xml:space="preserve">Django documentation</w:t>
+      </w:r>
+      <w:r>
+        <w:t xml:space="preserve"> (Versión 6.1). https://docs.djangoproject.com/en/6.1/</w:t>
       </w:r>
     </w:p>
     <w:p>
@@ -6903,17 +7811,17 @@
         <w:ind w:left="709" w:hanging="709"/>
       </w:pPr>
       <w:r>
-        <w:t xml:space="preserve">Figueroa, C. (2004). </w:t>
+        <w:t xml:space="preserve">Eby, P. J. (2010). </w:t>
       </w:r>
       <w:r>
         <w:rPr>
           <w:i/>
           <w:iCs/>
         </w:rPr>
-        <w:t xml:space="preserve">Sistemas de evaluación académica</w:t>
-      </w:r>
-      <w:r>
-        <w:t xml:space="preserve">. Editorial Universitaria.</w:t>
+        <w:t xml:space="preserve">PEP 3333 – Python Web Server Gateway Interface v1.0.1</w:t>
+      </w:r>
+      <w:r>
+        <w:t xml:space="preserve">. Python Software Foundation. https://peps.python.org/pep-3333/</w:t>
       </w:r>
     </w:p>
     <w:p>
@@ -6922,17 +7830,17 @@
         <w:ind w:left="709" w:hanging="709"/>
       </w:pPr>
       <w:r>
-        <w:t xml:space="preserve">Fowler, M. (2002). </w:t>
+        <w:t xml:space="preserve">Edel Navarro, R. (2003). El rendimiento académico: Concepto, investigación y desarrollo. </w:t>
       </w:r>
       <w:r>
         <w:rPr>
           <w:i/>
           <w:iCs/>
         </w:rPr>
-        <w:t xml:space="preserve">Patterns of enterprise application architecture</w:t>
-      </w:r>
-      <w:r>
-        <w:t xml:space="preserve">. Addison-Wesley.</w:t>
+        <w:t xml:space="preserve">REICE. Revista Iberoamericana sobre Calidad, Eficacia y Cambio en Educación, 1</w:t>
+      </w:r>
+      <w:r>
+        <w:t xml:space="preserve">(2).</w:t>
       </w:r>
     </w:p>
     <w:p>
@@ -6941,17 +7849,17 @@
         <w:ind w:left="709" w:hanging="709"/>
       </w:pPr>
       <w:r>
-        <w:t xml:space="preserve">Härder, T., &amp; Reuter, A. (1983). Principles of transaction-oriented database recovery. </w:t>
+        <w:t xml:space="preserve">Elmasri, R., &amp; Navathe, S. B. (2011). </w:t>
       </w:r>
       <w:r>
         <w:rPr>
           <w:i/>
           <w:iCs/>
         </w:rPr>
-        <w:t xml:space="preserve">ACM Computing Surveys, 15</w:t>
-      </w:r>
-      <w:r>
-        <w:t xml:space="preserve">(4), 287–317. https://doi.org/10.1145/289.291</w:t>
+        <w:t xml:space="preserve">Fundamentals of database systems</w:t>
+      </w:r>
+      <w:r>
+        <w:t xml:space="preserve"> (6th ed.). Addison-Wesley.</w:t>
       </w:r>
     </w:p>
     <w:p>
@@ -6960,17 +7868,17 @@
         <w:ind w:left="709" w:hanging="709"/>
       </w:pPr>
       <w:r>
-        <w:t xml:space="preserve">Institute of Electrical and Electronics Engineers. (1990). </w:t>
+        <w:t xml:space="preserve">Epstein, J. L. (2011). </w:t>
       </w:r>
       <w:r>
         <w:rPr>
           <w:i/>
           <w:iCs/>
         </w:rPr>
-        <w:t xml:space="preserve">IEEE standard glossary of software engineering terminology</w:t>
-      </w:r>
-      <w:r>
-        <w:t xml:space="preserve"> (IEEE Std 610.12-1990). IEEE.</w:t>
+        <w:t xml:space="preserve">School, family, and community partnerships: Preparing educators and improving schools</w:t>
+      </w:r>
+      <w:r>
+        <w:t xml:space="preserve"> (2nd ed.). Westview Press.</w:t>
       </w:r>
     </w:p>
     <w:p>
@@ -6979,17 +7887,17 @@
         <w:ind w:left="709" w:hanging="709"/>
       </w:pPr>
       <w:r>
-        <w:t xml:space="preserve">International Organization for Standardization. (2016). </w:t>
+        <w:t xml:space="preserve">Estado Plurinacional de Bolivia. (2009). </w:t>
       </w:r>
       <w:r>
         <w:rPr>
           <w:i/>
           <w:iCs/>
         </w:rPr>
-        <w:t xml:space="preserve">ISO/IEC 25023:2016. Systems and software engineering — Systems and software Quality Requirements and Evaluation (SQuaRE) — Measurement of system and software product quality</w:t>
-      </w:r>
-      <w:r>
-        <w:t xml:space="preserve">. ISO.</w:t>
+        <w:t xml:space="preserve">Constitución Política del Estado</w:t>
+      </w:r>
+      <w:r>
+        <w:t xml:space="preserve">. Gaceta Oficial de Bolivia.</w:t>
       </w:r>
     </w:p>
     <w:p>
@@ -6998,17 +7906,17 @@
         <w:ind w:left="709" w:hanging="709"/>
       </w:pPr>
       <w:r>
-        <w:t xml:space="preserve">International Organization for Standardization. (2018). </w:t>
+        <w:t xml:space="preserve">Estado Plurinacional de Bolivia. (2010). </w:t>
       </w:r>
       <w:r>
         <w:rPr>
           <w:i/>
           <w:iCs/>
         </w:rPr>
-        <w:t xml:space="preserve">ISO/IEC 27000:2018. Information technology — Security techniques — Information security management systems — Overview and vocabulary</w:t>
-      </w:r>
-      <w:r>
-        <w:t xml:space="preserve">. ISO.</w:t>
+        <w:t xml:space="preserve">Ley N.º 070 de la Educación «Avelino Siñani – Elizardo Pérez»</w:t>
+      </w:r>
+      <w:r>
+        <w:t xml:space="preserve">. Gaceta Oficial de Bolivia.</w:t>
       </w:r>
     </w:p>
     <w:p>
@@ -7017,17 +7925,17 @@
         <w:ind w:left="709" w:hanging="709"/>
       </w:pPr>
       <w:r>
-        <w:t xml:space="preserve">International Organization for Standardization. (2022). </w:t>
+        <w:t xml:space="preserve">Estado Plurinacional de Bolivia. (2011). </w:t>
       </w:r>
       <w:r>
         <w:rPr>
           <w:i/>
           <w:iCs/>
         </w:rPr>
-        <w:t xml:space="preserve">ISO/IEC/IEEE 29119-1:2022. Software and systems engineering — Software testing — Part 1: General concepts</w:t>
-      </w:r>
-      <w:r>
-        <w:t xml:space="preserve">. ISO.</w:t>
+        <w:t xml:space="preserve">Ley N.º 164 General de Telecomunicaciones, Tecnologías de Información y Comunicación</w:t>
+      </w:r>
+      <w:r>
+        <w:t xml:space="preserve">. Gaceta Oficial de Bolivia.</w:t>
       </w:r>
     </w:p>
     <w:p>
@@ -7036,17 +7944,17 @@
         <w:ind w:left="709" w:hanging="709"/>
       </w:pPr>
       <w:r>
-        <w:t xml:space="preserve">International Organization for Standardization. (2023). </w:t>
+        <w:t xml:space="preserve">Estado Plurinacional de Bolivia. (2013). </w:t>
       </w:r>
       <w:r>
         <w:rPr>
           <w:i/>
           <w:iCs/>
         </w:rPr>
-        <w:t xml:space="preserve">ISO/IEC 25010:2023. Systems and software engineering — Systems and software Quality Requirements and Evaluation (SQuaRE) — Product quality model</w:t>
-      </w:r>
-      <w:r>
-        <w:t xml:space="preserve">. ISO.</w:t>
+        <w:t xml:space="preserve">Decreto Supremo N.º 1793. Reglamento a la Ley N.º 164 para el desarrollo de tecnologías de información y comunicación</w:t>
+      </w:r>
+      <w:r>
+        <w:t xml:space="preserve">. Gaceta Oficial de Bolivia.</w:t>
       </w:r>
     </w:p>
     <w:p>
@@ -7055,17 +7963,17 @@
         <w:ind w:left="709" w:hanging="709"/>
       </w:pPr>
       <w:r>
-        <w:t xml:space="preserve">Krasner, G. E., &amp; Pope, S. T. (1988). A cookbook for using the model-view controller user interface paradigm in Smalltalk-80. </w:t>
+        <w:t xml:space="preserve">Figueroa, C. (2004). </w:t>
       </w:r>
       <w:r>
         <w:rPr>
           <w:i/>
           <w:iCs/>
         </w:rPr>
-        <w:t xml:space="preserve">Journal of Object-Oriented Programming, 1</w:t>
-      </w:r>
-      <w:r>
-        <w:t xml:space="preserve">(3), 26–49.</w:t>
+        <w:t xml:space="preserve">Sistemas de evaluación académica</w:t>
+      </w:r>
+      <w:r>
+        <w:t xml:space="preserve">. Editorial Universitaria.</w:t>
       </w:r>
     </w:p>
     <w:p>
@@ -7074,17 +7982,17 @@
         <w:ind w:left="709" w:hanging="709"/>
       </w:pPr>
       <w:r>
-        <w:t xml:space="preserve">Laudon, K. C., &amp; Laudon, J. P. (2016). </w:t>
+        <w:t xml:space="preserve">Fowler, M. (2002). </w:t>
       </w:r>
       <w:r>
         <w:rPr>
           <w:i/>
           <w:iCs/>
         </w:rPr>
-        <w:t xml:space="preserve">Sistemas de información gerencial</w:t>
-      </w:r>
-      <w:r>
-        <w:t xml:space="preserve"> (14.ª ed.). Pearson Educación.</w:t>
+        <w:t xml:space="preserve">Patterns of enterprise application architecture</w:t>
+      </w:r>
+      <w:r>
+        <w:t xml:space="preserve">. Addison-Wesley.</w:t>
       </w:r>
     </w:p>
     <w:p>
@@ -7093,17 +8001,17 @@
         <w:ind w:left="709" w:hanging="709"/>
       </w:pPr>
       <w:r>
-        <w:t xml:space="preserve">Lutz, M. (2013). </w:t>
+        <w:t xml:space="preserve">Hodges, J., Jackson, C., &amp; Barth, A. (2012). </w:t>
       </w:r>
       <w:r>
         <w:rPr>
           <w:i/>
           <w:iCs/>
         </w:rPr>
-        <w:t xml:space="preserve">Learning Python</w:t>
-      </w:r>
-      <w:r>
-        <w:t xml:space="preserve"> (5th ed.). O'Reilly Media.</w:t>
+        <w:t xml:space="preserve">RFC 6797: HTTP Strict Transport Security (HSTS)</w:t>
+      </w:r>
+      <w:r>
+        <w:t xml:space="preserve">. Internet Engineering Task Force. https://doi.org/10.17487/RFC6797</w:t>
       </w:r>
     </w:p>
     <w:p>
@@ -7112,17 +8020,17 @@
         <w:ind w:left="709" w:hanging="709"/>
       </w:pPr>
       <w:r>
-        <w:t xml:space="preserve">Marcotte, E. (2011). </w:t>
+        <w:t xml:space="preserve">Härder, T., &amp; Reuter, A. (1983). Principles of transaction-oriented database recovery. </w:t>
       </w:r>
       <w:r>
         <w:rPr>
           <w:i/>
           <w:iCs/>
         </w:rPr>
-        <w:t xml:space="preserve">Responsive web design</w:t>
-      </w:r>
-      <w:r>
-        <w:t xml:space="preserve">. A Book Apart.</w:t>
+        <w:t xml:space="preserve">ACM Computing Surveys, 15</w:t>
+      </w:r>
+      <w:r>
+        <w:t xml:space="preserve">(4), 287–317. https://doi.org/10.1145/289.291</w:t>
       </w:r>
     </w:p>
     <w:p>
@@ -7131,17 +8039,17 @@
         <w:ind w:left="709" w:hanging="709"/>
       </w:pPr>
       <w:r>
-        <w:t xml:space="preserve">McCall, J. A., Richards, P. K., &amp; Walters, G. F. (1977). </w:t>
+        <w:t xml:space="preserve">Institute of Electrical and Electronics Engineers. (1990). </w:t>
       </w:r>
       <w:r>
         <w:rPr>
           <w:i/>
           <w:iCs/>
         </w:rPr>
-        <w:t xml:space="preserve">Factors in software quality</w:t>
-      </w:r>
-      <w:r>
-        <w:t xml:space="preserve"> (RADC-TR-77-369). Rome Air Development Center.</w:t>
+        <w:t xml:space="preserve">IEEE standard glossary of software engineering terminology</w:t>
+      </w:r>
+      <w:r>
+        <w:t xml:space="preserve"> (IEEE Std 610.12-1990). IEEE.</w:t>
       </w:r>
     </w:p>
     <w:p>
@@ -7150,17 +8058,17 @@
         <w:ind w:left="709" w:hanging="709"/>
       </w:pPr>
       <w:r>
-        <w:t xml:space="preserve">Ministerio de Educación. (2023). </w:t>
+        <w:t xml:space="preserve">International Organization for Standardization. (2011). </w:t>
       </w:r>
       <w:r>
         <w:rPr>
           <w:i/>
           <w:iCs/>
         </w:rPr>
-        <w:t xml:space="preserve">Normas generales para la gestión educativa y escolar 2023 del Subsistema de Educación Regular</w:t>
-      </w:r>
-      <w:r>
-        <w:t xml:space="preserve">. Ministerio de Educación del Estado Plurinacional de Bolivia.</w:t>
+        <w:t xml:space="preserve">ISO/IEC 29100:2011. Information technology — Security techniques — Privacy framework</w:t>
+      </w:r>
+      <w:r>
+        <w:t xml:space="preserve">. ISO.</w:t>
       </w:r>
     </w:p>
     <w:p>
@@ -7169,17 +8077,264 @@
         <w:ind w:left="709" w:hanging="709"/>
       </w:pPr>
       <w:r>
-        <w:t xml:space="preserve">Myers, G. J., Sandler, C., &amp; Badgett, T. (2011). </w:t>
+        <w:t xml:space="preserve">International Organization for Standardization. (2016). </w:t>
       </w:r>
       <w:r>
         <w:rPr>
           <w:i/>
           <w:iCs/>
         </w:rPr>
+        <w:t xml:space="preserve">ISO/IEC 25023:2016. Systems and software engineering — Systems and software Quality Requirements and Evaluation (SQuaRE) — Measurement of system and software product quality</w:t>
+      </w:r>
+      <w:r>
+        <w:t xml:space="preserve">. ISO.</w:t>
+      </w:r>
+    </w:p>
+    <w:p>
+      <w:pPr>
+        <w:spacing w:after="120" w:line="360"/>
+        <w:ind w:left="709" w:hanging="709"/>
+      </w:pPr>
+      <w:r>
+        <w:t xml:space="preserve">International Organization for Standardization. (2018). </w:t>
+      </w:r>
+      <w:r>
+        <w:rPr>
+          <w:i/>
+          <w:iCs/>
+        </w:rPr>
+        <w:t xml:space="preserve">ISO/IEC 27000:2018. Information technology — Security techniques — Information security management systems — Overview and vocabulary</w:t>
+      </w:r>
+      <w:r>
+        <w:t xml:space="preserve">. ISO.</w:t>
+      </w:r>
+    </w:p>
+    <w:p>
+      <w:pPr>
+        <w:spacing w:after="120" w:line="360"/>
+        <w:ind w:left="709" w:hanging="709"/>
+      </w:pPr>
+      <w:r>
+        <w:t xml:space="preserve">International Organization for Standardization. (2022). </w:t>
+      </w:r>
+      <w:r>
+        <w:rPr>
+          <w:i/>
+          <w:iCs/>
+        </w:rPr>
+        <w:t xml:space="preserve">ISO/IEC/IEEE 29119-1:2022. Software and systems engineering — Software testing — Part 1: General concepts</w:t>
+      </w:r>
+      <w:r>
+        <w:t xml:space="preserve">. ISO.</w:t>
+      </w:r>
+    </w:p>
+    <w:p>
+      <w:pPr>
+        <w:spacing w:after="120" w:line="360"/>
+        <w:ind w:left="709" w:hanging="709"/>
+      </w:pPr>
+      <w:r>
+        <w:t xml:space="preserve">International Organization for Standardization. (2023). </w:t>
+      </w:r>
+      <w:r>
+        <w:rPr>
+          <w:i/>
+          <w:iCs/>
+        </w:rPr>
+        <w:t xml:space="preserve">ISO/IEC 25010:2023. Systems and software engineering — Systems and software Quality Requirements and Evaluation (SQuaRE) — Product quality model</w:t>
+      </w:r>
+      <w:r>
+        <w:t xml:space="preserve">. ISO.</w:t>
+      </w:r>
+    </w:p>
+    <w:p>
+      <w:pPr>
+        <w:spacing w:after="120" w:line="360"/>
+        <w:ind w:left="709" w:hanging="709"/>
+      </w:pPr>
+      <w:r>
+        <w:t xml:space="preserve">Jeynes, W. H. (2007). The relationship between parental involvement and urban secondary school student academic achievement: A meta-analysis. </w:t>
+      </w:r>
+      <w:r>
+        <w:rPr>
+          <w:i/>
+          <w:iCs/>
+        </w:rPr>
+        <w:t xml:space="preserve">Urban Education, 42</w:t>
+      </w:r>
+      <w:r>
+        <w:t xml:space="preserve">(1), 82–110. https://doi.org/10.1177/0042085906293818</w:t>
+      </w:r>
+    </w:p>
+    <w:p>
+      <w:pPr>
+        <w:spacing w:after="120" w:line="360"/>
+        <w:ind w:left="709" w:hanging="709"/>
+      </w:pPr>
+      <w:r>
+        <w:t xml:space="preserve">Krasner, G. E., &amp; Pope, S. T. (1988). A cookbook for using the model-view controller user interface paradigm in Smalltalk-80. </w:t>
+      </w:r>
+      <w:r>
+        <w:rPr>
+          <w:i/>
+          <w:iCs/>
+        </w:rPr>
+        <w:t xml:space="preserve">Journal of Object-Oriented Programming, 1</w:t>
+      </w:r>
+      <w:r>
+        <w:t xml:space="preserve">(3), 26–49.</w:t>
+      </w:r>
+    </w:p>
+    <w:p>
+      <w:pPr>
+        <w:spacing w:after="120" w:line="360"/>
+        <w:ind w:left="709" w:hanging="709"/>
+      </w:pPr>
+      <w:r>
+        <w:t xml:space="preserve">Laudon, K. C., &amp; Laudon, J. P. (2016). </w:t>
+      </w:r>
+      <w:r>
+        <w:rPr>
+          <w:i/>
+          <w:iCs/>
+        </w:rPr>
+        <w:t xml:space="preserve">Sistemas de información gerencial</w:t>
+      </w:r>
+      <w:r>
+        <w:t xml:space="preserve"> (14.ª ed.). Pearson Educación.</w:t>
+      </w:r>
+    </w:p>
+    <w:p>
+      <w:pPr>
+        <w:spacing w:after="120" w:line="360"/>
+        <w:ind w:left="709" w:hanging="709"/>
+      </w:pPr>
+      <w:r>
+        <w:t xml:space="preserve">Lutz, M. (2013). </w:t>
+      </w:r>
+      <w:r>
+        <w:rPr>
+          <w:i/>
+          <w:iCs/>
+        </w:rPr>
+        <w:t xml:space="preserve">Learning Python</w:t>
+      </w:r>
+      <w:r>
+        <w:t xml:space="preserve"> (5th ed.). O'Reilly Media.</w:t>
+      </w:r>
+    </w:p>
+    <w:p>
+      <w:pPr>
+        <w:spacing w:after="120" w:line="360"/>
+        <w:ind w:left="709" w:hanging="709"/>
+      </w:pPr>
+      <w:r>
+        <w:t xml:space="preserve">Marcotte, E. (2011). </w:t>
+      </w:r>
+      <w:r>
+        <w:rPr>
+          <w:i/>
+          <w:iCs/>
+        </w:rPr>
+        <w:t xml:space="preserve">Responsive web design</w:t>
+      </w:r>
+      <w:r>
+        <w:t xml:space="preserve">. A Book Apart.</w:t>
+      </w:r>
+    </w:p>
+    <w:p>
+      <w:pPr>
+        <w:spacing w:after="120" w:line="360"/>
+        <w:ind w:left="709" w:hanging="709"/>
+      </w:pPr>
+      <w:r>
+        <w:t xml:space="preserve">McCall, J. A., Richards, P. K., &amp; Walters, G. F. (1977). </w:t>
+      </w:r>
+      <w:r>
+        <w:rPr>
+          <w:i/>
+          <w:iCs/>
+        </w:rPr>
+        <w:t xml:space="preserve">Factors in software quality</w:t>
+      </w:r>
+      <w:r>
+        <w:t xml:space="preserve"> (RADC-TR-77-369). Rome Air Development Center.</w:t>
+      </w:r>
+    </w:p>
+    <w:p>
+      <w:pPr>
+        <w:spacing w:after="120" w:line="360"/>
+        <w:ind w:left="709" w:hanging="709"/>
+      </w:pPr>
+      <w:r>
+        <w:t xml:space="preserve">Mell, P., &amp; Grance, T. (2011). </w:t>
+      </w:r>
+      <w:r>
+        <w:rPr>
+          <w:i/>
+          <w:iCs/>
+        </w:rPr>
+        <w:t xml:space="preserve">The NIST definition of cloud computing</w:t>
+      </w:r>
+      <w:r>
+        <w:t xml:space="preserve"> (NIST Special Publication 800-145). National Institute of Standards and Technology. https://doi.org/10.6028/NIST.SP.800-145</w:t>
+      </w:r>
+    </w:p>
+    <w:p>
+      <w:pPr>
+        <w:spacing w:after="120" w:line="360"/>
+        <w:ind w:left="709" w:hanging="709"/>
+      </w:pPr>
+      <w:r>
+        <w:t xml:space="preserve">Ministerio de Educación. (2023). </w:t>
+      </w:r>
+      <w:r>
+        <w:rPr>
+          <w:i/>
+          <w:iCs/>
+        </w:rPr>
+        <w:t xml:space="preserve">Normas generales para la gestión educativa y escolar 2023 del Subsistema de Educación Regular</w:t>
+      </w:r>
+      <w:r>
+        <w:t xml:space="preserve">. Ministerio de Educación del Estado Plurinacional de Bolivia.</w:t>
+      </w:r>
+    </w:p>
+    <w:p>
+      <w:pPr>
+        <w:spacing w:after="120" w:line="360"/>
+        <w:ind w:left="709" w:hanging="709"/>
+      </w:pPr>
+      <w:r>
+        <w:t xml:space="preserve">Myers, G. J., Sandler, C., &amp; Badgett, T. (2011). </w:t>
+      </w:r>
+      <w:r>
+        <w:rPr>
+          <w:i/>
+          <w:iCs/>
+        </w:rPr>
         <w:t xml:space="preserve">The art of software testing</w:t>
       </w:r>
       <w:r>
         <w:t xml:space="preserve"> (3rd ed.). John Wiley &amp; Sons.</w:t>
+      </w:r>
+    </w:p>
+    <w:p>
+      <w:pPr>
+        <w:spacing w:after="120" w:line="360"/>
+        <w:ind w:left="709" w:hanging="709"/>
+      </w:pPr>
+      <w:r>
+        <w:t xml:space="preserve">National Institute of Standards and Technology. (2010). </w:t>
+      </w:r>
+      <w:r>
+        <w:rPr>
+          <w:i/>
+          <w:iCs/>
+        </w:rPr>
+        <w:t xml:space="preserve">Contingency planning guide for federal information systems</w:t>
+      </w:r>
+      <w:r>
+        <w:t xml:space="preserve"> (NIST Special Publication 800-34, Rev. 1). https://doi.org/10.6028/NIST.SP.800-34r1</w:t>
       </w:r>
     </w:p>
     <w:p>
@@ -7456,6 +8611,44 @@
         <w:ind w:left="709" w:hanging="709"/>
       </w:pPr>
       <w:r>
+        <w:t xml:space="preserve">Thomson, M., &amp; Beverloo, P. (2017). </w:t>
+      </w:r>
+      <w:r>
+        <w:rPr>
+          <w:i/>
+          <w:iCs/>
+        </w:rPr>
+        <w:t xml:space="preserve">RFC 8292: Voluntary Application Server Identification (VAPID) for Web Push</w:t>
+      </w:r>
+      <w:r>
+        <w:t xml:space="preserve">. Internet Engineering Task Force. https://doi.org/10.17487/RFC8292</w:t>
+      </w:r>
+    </w:p>
+    <w:p>
+      <w:pPr>
+        <w:spacing w:after="120" w:line="360"/>
+        <w:ind w:left="709" w:hanging="709"/>
+      </w:pPr>
+      <w:r>
+        <w:t xml:space="preserve">Thomson, M., Damaggio, E., &amp; Raymor, B. (2016). </w:t>
+      </w:r>
+      <w:r>
+        <w:rPr>
+          <w:i/>
+          <w:iCs/>
+        </w:rPr>
+        <w:t xml:space="preserve">RFC 8030: Generic Event Delivery Using HTTP Push</w:t>
+      </w:r>
+      <w:r>
+        <w:t xml:space="preserve">. Internet Engineering Task Force. https://doi.org/10.17487/RFC8030</w:t>
+      </w:r>
+    </w:p>
+    <w:p>
+      <w:pPr>
+        <w:spacing w:after="120" w:line="360"/>
+        <w:ind w:left="709" w:hanging="709"/>
+      </w:pPr>
+      <w:r>
         <w:t xml:space="preserve">Viveros, </w:t>
       </w:r>
       <w:r>
@@ -7508,6 +8701,63 @@
       </w:r>
       <w:r>
         <w:t xml:space="preserve">. https://html.spec.whatwg.org/</w:t>
+      </w:r>
+    </w:p>
+    <w:p>
+      <w:pPr>
+        <w:spacing w:after="120" w:line="360"/>
+        <w:ind w:left="709" w:hanging="709"/>
+      </w:pPr>
+      <w:r>
+        <w:t xml:space="preserve">Wiggins, A. (2017). </w:t>
+      </w:r>
+      <w:r>
+        <w:rPr>
+          <w:i/>
+          <w:iCs/>
+        </w:rPr>
+        <w:t xml:space="preserve">The twelve-factor app</w:t>
+      </w:r>
+      <w:r>
+        <w:t xml:space="preserve">. https://12factor.net/es/</w:t>
+      </w:r>
+    </w:p>
+    <w:p>
+      <w:pPr>
+        <w:spacing w:after="120" w:line="360"/>
+        <w:ind w:left="709" w:hanging="709"/>
+      </w:pPr>
+      <w:r>
+        <w:t xml:space="preserve">World Wide Web Consortium. (2025a). </w:t>
+      </w:r>
+      <w:r>
+        <w:rPr>
+          <w:i/>
+          <w:iCs/>
+        </w:rPr>
+        <w:t xml:space="preserve">Web application manifest</w:t>
+      </w:r>
+      <w:r>
+        <w:t xml:space="preserve">. https://www.w3.org/TR/appmanifest/</w:t>
+      </w:r>
+    </w:p>
+    <w:p>
+      <w:pPr>
+        <w:spacing w:after="120" w:line="360"/>
+        <w:ind w:left="709" w:hanging="709"/>
+      </w:pPr>
+      <w:r>
+        <w:t xml:space="preserve">World Wide Web Consortium. (2025b). </w:t>
+      </w:r>
+      <w:r>
+        <w:rPr>
+          <w:i/>
+          <w:iCs/>
+        </w:rPr>
+        <w:t xml:space="preserve">Service workers</w:t>
+      </w:r>
+      <w:r>
+        <w:t xml:space="preserve">. https://www.w3.org/TR/service-workers/</w:t>
       </w:r>
     </w:p>
     <w:sectPr>

</xml_diff>